<commit_message>
Manual operativo: apertura más directa, techo 40/80 en recuadro propio, checklist final, corrige refs rotas
</commit_message>
<xml_diff>
--- a/docs/MANUAL_OPERATIVO.docx
+++ b/docs/MANUAL_OPERATIVO.docx
@@ -13,6 +13,417 @@
           <w:bCs/>
         </w:rPr>
         <w:t xml:space="preserve">MANUAL OPERATIVO — SOP Research Engine</w:t>
+      </w:r>
+    </w:p>
+    <w:p>
+      <w:pPr>
+        <w:spacing w:after="160" w:line="300"/>
+      </w:pPr>
+      <w:r>
+        <w:t xml:space="preserve">Este manual sirve para operar el SOP en la práctica.</w:t>
+      </w:r>
+    </w:p>
+    <w:p>
+      <w:pPr>
+        <w:spacing w:after="160" w:line="300"/>
+      </w:pPr>
+      <w:r>
+        <w:t xml:space="preserve">No explica por qué existen las reglas ni cómo está diseñado el sistema. Eso vive en </w:t>
+      </w:r>
+      <w:r>
+        <w:rPr>
+          <w:rFonts w:ascii="Consolas" w:cs="Consolas" w:eastAsia="Consolas" w:hAnsi="Consolas"/>
+          <w:sz w:val="21"/>
+          <w:szCs w:val="21"/>
+        </w:rPr>
+        <w:t xml:space="preserve">docs/GOVERNANCE/SOP_ENGINE_PROJECT_STATUS.md</w:t>
+      </w:r>
+      <w:r>
+        <w:t xml:space="preserve">.</w:t>
+      </w:r>
+    </w:p>
+    <w:p>
+      <w:pPr>
+        <w:spacing w:after="40" w:line="300"/>
+      </w:pPr>
+      <w:r>
+        <w:t xml:space="preserve">Aquí solo se explica:</w:t>
+      </w:r>
+    </w:p>
+    <w:p>
+      <w:pPr>
+        <w:pStyle w:val="ListParagraph"/>
+        <w:numPr>
+          <w:ilvl w:val="0"/>
+          <w:numId w:val="2"/>
+        </w:numPr>
+        <w:spacing w:after="100" w:line="300"/>
+      </w:pPr>
+      <w:r>
+        <w:t xml:space="preserve">qué revisar;</w:t>
+      </w:r>
+    </w:p>
+    <w:p>
+      <w:pPr>
+        <w:pStyle w:val="ListParagraph"/>
+        <w:numPr>
+          <w:ilvl w:val="0"/>
+          <w:numId w:val="2"/>
+        </w:numPr>
+        <w:spacing w:after="100" w:line="300"/>
+      </w:pPr>
+      <w:r>
+        <w:t xml:space="preserve">qué rellenar;</w:t>
+      </w:r>
+    </w:p>
+    <w:p>
+      <w:pPr>
+        <w:pStyle w:val="ListParagraph"/>
+        <w:numPr>
+          <w:ilvl w:val="0"/>
+          <w:numId w:val="2"/>
+        </w:numPr>
+        <w:spacing w:after="100" w:line="300"/>
+      </w:pPr>
+      <w:r>
+        <w:t xml:space="preserve">cuándo actuar;</w:t>
+      </w:r>
+    </w:p>
+    <w:p>
+      <w:pPr>
+        <w:pStyle w:val="ListParagraph"/>
+        <w:numPr>
+          <w:ilvl w:val="0"/>
+          <w:numId w:val="2"/>
+        </w:numPr>
+        <w:spacing w:after="100" w:line="300"/>
+      </w:pPr>
+      <w:r>
+        <w:t xml:space="preserve">cuándo no hacer nada.</w:t>
+      </w:r>
+    </w:p>
+    <w:p>
+      <w:pPr>
+        <w:spacing w:after="160" w:line="300"/>
+      </w:pPr>
+      <w:r>
+        <w:t xml:space="preserve">Se escribe bloque a bloque, en el orden en que cada pieza queda cerrada. Hoy: Dry Powder Protocol. Human Approval, pendiente.</w:t>
+      </w:r>
+    </w:p>
+    <w:p>
+      <w:pPr>
+        <w:pStyle w:val="Heading1"/>
+        <w:spacing w:after="160" w:before="320"/>
+      </w:pPr>
+      <w:r>
+        <w:t xml:space="preserve">1. Dry Powder Protocol</w:t>
+      </w:r>
+    </w:p>
+    <w:p>
+      <w:pPr>
+        <w:pStyle w:val="Heading2"/>
+        <w:spacing w:after="120" w:before="280"/>
+      </w:pPr>
+      <w:r>
+        <w:t xml:space="preserve">1.1 De qué va, en 30 segundos</w:t>
+      </w:r>
+    </w:p>
+    <w:p>
+      <w:pPr>
+        <w:pStyle w:val="ListParagraph"/>
+        <w:numPr>
+          <w:ilvl w:val="0"/>
+          <w:numId w:val="2"/>
+        </w:numPr>
+        <w:spacing w:after="100" w:line="300"/>
+      </w:pPr>
+      <w:r>
+        <w:rPr>
+          <w:b/>
+          <w:bCs/>
+        </w:rPr>
+        <w:t xml:space="preserve">El problema que evita: </w:t>
+      </w:r>
+      <w:r>
+        <w:t xml:space="preserve">que te quedes paralizado esperando el “suelo perfecto”, o que te gastes toda la pólvora seca en la primera caída y no te quede nada si el mercado tiene una segunda pierna peor.</w:t>
+      </w:r>
+    </w:p>
+    <w:p>
+      <w:pPr>
+        <w:pStyle w:val="ListParagraph"/>
+        <w:numPr>
+          <w:ilvl w:val="0"/>
+          <w:numId w:val="2"/>
+        </w:numPr>
+        <w:spacing w:after="100" w:line="300"/>
+      </w:pPr>
+      <w:r>
+        <w:rPr>
+          <w:b/>
+          <w:bCs/>
+        </w:rPr>
+        <w:t xml:space="preserve">Qué hace: </w:t>
+      </w:r>
+      <w:r>
+        <w:t xml:space="preserve">convierte una postura (ej. </w:t>
+      </w:r>
+      <w:r>
+        <w:rPr>
+          <w:rFonts w:ascii="Consolas" w:cs="Consolas" w:eastAsia="Consolas" w:hAnsi="Consolas"/>
+          <w:sz w:val="21"/>
+          <w:szCs w:val="21"/>
+        </w:rPr>
+        <w:t xml:space="preserve">Deploy Partially</w:t>
+      </w:r>
+      <w:r>
+        <w:t xml:space="preserve">) en una cifra concreta de euros a desplegar, tramo a tramo.</w:t>
+      </w:r>
+    </w:p>
+    <w:p>
+      <w:pPr>
+        <w:pStyle w:val="ListParagraph"/>
+        <w:numPr>
+          <w:ilvl w:val="0"/>
+          <w:numId w:val="2"/>
+        </w:numPr>
+        <w:spacing w:after="100" w:line="300"/>
+      </w:pPr>
+      <w:r>
+        <w:rPr>
+          <w:b/>
+          <w:bCs/>
+        </w:rPr>
+        <w:t xml:space="preserve">Dónde encaja: </w:t>
+      </w:r>
+      <w:r>
+        <w:t xml:space="preserve">este protocolo no decide si hoy es buen momento — eso ya lo deciden antes las otras piezas del SOP (Evidence Quality, Regime Comparability, Personal Capacity), que combinadas producen la postura del día. Dry Powder Protocol arranca </w:t>
+      </w:r>
+      <w:r>
+        <w:rPr>
+          <w:i/>
+          <w:iCs/>
+        </w:rPr>
+        <w:t xml:space="preserve">después</w:t>
+      </w:r>
+      <w:r>
+        <w:t xml:space="preserve">: dado que la postura de hoy ya autoriza desplegar algo, ¿cuánto exactamente?</w:t>
+      </w:r>
+    </w:p>
+    <w:p>
+      <w:pPr>
+        <w:pStyle w:val="ListParagraph"/>
+        <w:numPr>
+          <w:ilvl w:val="0"/>
+          <w:numId w:val="2"/>
+        </w:numPr>
+        <w:spacing w:after="100" w:line="300"/>
+      </w:pPr>
+      <w:r>
+        <w:rPr>
+          <w:b/>
+          <w:bCs/>
+        </w:rPr>
+        <w:t xml:space="preserve">Importante: </w:t>
+      </w:r>
+      <w:r>
+        <w:t xml:space="preserve">este protocolo no ejecuta nada. No mueve dinero, no conecta con ningún bróker. Solo te dice si, según las reglas, hoy se puede desplegar un tramo y cuál sería el importe — la decisión de ejecutarlo es siempre tuya.</w:t>
+      </w:r>
+    </w:p>
+    <w:p>
+      <w:pPr>
+        <w:pStyle w:val="Heading3"/>
+        <w:spacing w:after="100" w:before="220"/>
+      </w:pPr>
+      <w:r>
+        <w:t xml:space="preserve">Las 4 reglas clave</w:t>
+      </w:r>
+    </w:p>
+    <w:p>
+      <w:pPr>
+        <w:pStyle w:val="ListParagraph"/>
+        <w:numPr>
+          <w:ilvl w:val="0"/>
+          <w:numId w:val="3"/>
+        </w:numPr>
+        <w:spacing w:after="160" w:line="300"/>
+      </w:pPr>
+      <w:r>
+        <w:rPr>
+          <w:b/>
+          <w:bCs/>
+        </w:rPr>
+        <w:t xml:space="preserve">Porcentaje sobre lo que queda, no sobre el total inicial. </w:t>
+      </w:r>
+      <w:r>
+        <w:t xml:space="preserve">Cada tramo usa un % de la pólvora seca </w:t>
+      </w:r>
+      <w:r>
+        <w:rPr>
+          <w:i/>
+          <w:iCs/>
+        </w:rPr>
+        <w:t xml:space="preserve">restante</w:t>
+      </w:r>
+      <w:r>
+        <w:t xml:space="preserve"> (12% en </w:t>
+      </w:r>
+      <w:r>
+        <w:rPr>
+          <w:rFonts w:ascii="Consolas" w:cs="Consolas" w:eastAsia="Consolas" w:hAnsi="Consolas"/>
+          <w:sz w:val="21"/>
+          <w:szCs w:val="21"/>
+        </w:rPr>
+        <w:t xml:space="preserve">Deploy Partially</w:t>
+      </w:r>
+      <w:r>
+        <w:t xml:space="preserve">, 22% en </w:t>
+      </w:r>
+      <w:r>
+        <w:rPr>
+          <w:rFonts w:ascii="Consolas" w:cs="Consolas" w:eastAsia="Consolas" w:hAnsi="Consolas"/>
+          <w:sz w:val="21"/>
+          <w:szCs w:val="21"/>
+        </w:rPr>
+        <w:t xml:space="preserve">Deploy Aggressively</w:t>
+      </w:r>
+      <w:r>
+        <w:t xml:space="preserve">). Esto por sí solo no te deja nunca a cero, pero tampoco basta: si el episodio dura mucho, tramo a tramo puedes acabar desplegando casi todo sin que ninguna decisión concreta haya autorizado ese total — para eso está la regla 3.</w:t>
+      </w:r>
+    </w:p>
+    <w:p>
+      <w:pPr>
+        <w:pStyle w:val="ListParagraph"/>
+        <w:numPr>
+          <w:ilvl w:val="0"/>
+          <w:numId w:val="3"/>
+        </w:numPr>
+        <w:spacing w:after="160" w:line="300"/>
+      </w:pPr>
+      <w:r>
+        <w:rPr>
+          <w:b/>
+          <w:bCs/>
+        </w:rPr>
+        <w:t xml:space="preserve">Cadencia dual (espaciado obligatorio). </w:t>
+      </w:r>
+      <w:r>
+        <w:t xml:space="preserve">Entre un tramo y otro deben pasar días mínimos (30 en </w:t>
+      </w:r>
+      <w:r>
+        <w:rPr>
+          <w:rFonts w:ascii="Consolas" w:cs="Consolas" w:eastAsia="Consolas" w:hAnsi="Consolas"/>
+          <w:sz w:val="21"/>
+          <w:szCs w:val="21"/>
+        </w:rPr>
+        <w:t xml:space="preserve">Partially</w:t>
+      </w:r>
+      <w:r>
+        <w:t xml:space="preserve">, 14 en </w:t>
+      </w:r>
+      <w:r>
+        <w:rPr>
+          <w:rFonts w:ascii="Consolas" w:cs="Consolas" w:eastAsia="Consolas" w:hAnsi="Consolas"/>
+          <w:sz w:val="21"/>
+          <w:szCs w:val="21"/>
+        </w:rPr>
+        <w:t xml:space="preserve">Aggressively</w:t>
+      </w:r>
+      <w:r>
+        <w:t xml:space="preserve">) </w:t>
+      </w:r>
+      <w:r>
+        <w:rPr>
+          <w:b/>
+          <w:bCs/>
+        </w:rPr>
+        <w:t xml:space="preserve">o</w:t>
+      </w:r>
+      <w:r>
+        <w:t xml:space="preserve"> una caída adicional del mercado de 5 puntos porcentuales. Basta con que se cumpla una de las dos, no las dos a la vez.</w:t>
+      </w:r>
+    </w:p>
+    <w:p>
+      <w:pPr>
+        <w:pStyle w:val="ListParagraph"/>
+        <w:numPr>
+          <w:ilvl w:val="0"/>
+          <w:numId w:val="3"/>
+        </w:numPr>
+        <w:spacing w:after="160" w:line="300"/>
+      </w:pPr>
+      <w:r>
+        <w:rPr>
+          <w:b/>
+          <w:bCs/>
+        </w:rPr>
+        <w:t xml:space="preserve">Techo de seguridad por episodio, cortafuegos, no control diario. </w:t>
+      </w:r>
+      <w:r>
+        <w:t xml:space="preserve">No puedes desplegar en total más del 40% de la pólvora inicial en </w:t>
+      </w:r>
+      <w:r>
+        <w:rPr>
+          <w:rFonts w:ascii="Consolas" w:cs="Consolas" w:eastAsia="Consolas" w:hAnsi="Consolas"/>
+          <w:sz w:val="21"/>
+          <w:szCs w:val="21"/>
+        </w:rPr>
+        <w:t xml:space="preserve">Partially</w:t>
+      </w:r>
+      <w:r>
+        <w:t xml:space="preserve"> ni más del 80% en </w:t>
+      </w:r>
+      <w:r>
+        <w:rPr>
+          <w:rFonts w:ascii="Consolas" w:cs="Consolas" w:eastAsia="Consolas" w:hAnsi="Consolas"/>
+          <w:sz w:val="21"/>
+          <w:szCs w:val="21"/>
+        </w:rPr>
+        <w:t xml:space="preserve">Aggressively</w:t>
+      </w:r>
+      <w:r>
+        <w:t xml:space="preserve">. Si lo alcanzas, se frena. El techo del 40% y el del 80% no funcionan igual — ver el aviso justo debajo de esta lista.</w:t>
+      </w:r>
+    </w:p>
+    <w:p>
+      <w:pPr>
+        <w:pStyle w:val="ListParagraph"/>
+        <w:numPr>
+          <w:ilvl w:val="0"/>
+          <w:numId w:val="3"/>
+        </w:numPr>
+        <w:spacing w:after="160" w:line="300"/>
+      </w:pPr>
+      <w:r>
+        <w:rPr>
+          <w:b/>
+          <w:bCs/>
+        </w:rPr>
+        <w:t xml:space="preserve">Ratchet: el techo no retrocede dentro del mismo episodio. </w:t>
+      </w:r>
+      <w:r>
+        <w:t xml:space="preserve">Si el mercado empeora y subes a </w:t>
+      </w:r>
+      <w:r>
+        <w:rPr>
+          <w:rFonts w:ascii="Consolas" w:cs="Consolas" w:eastAsia="Consolas" w:hAnsi="Consolas"/>
+          <w:sz w:val="21"/>
+          <w:szCs w:val="21"/>
+        </w:rPr>
+        <w:t xml:space="preserve">Aggressively</w:t>
+      </w:r>
+      <w:r>
+        <w:t xml:space="preserve">, ese techo se mantiene como referencia aunque luego la postura se relaje a </w:t>
+      </w:r>
+      <w:r>
+        <w:rPr>
+          <w:rFonts w:ascii="Consolas" w:cs="Consolas" w:eastAsia="Consolas" w:hAnsi="Consolas"/>
+          <w:sz w:val="21"/>
+          <w:szCs w:val="21"/>
+        </w:rPr>
+        <w:t xml:space="preserve">Partially</w:t>
+      </w:r>
+      <w:r>
+        <w:t xml:space="preserve"> — no se “recarga” capacidad de tramo por bajar y volver a subir. Solo se resetea cuando el episodio se cierra de verdad (recuperación completa, ver 1.4).</w:t>
       </w:r>
     </w:p>
     <w:p>
@@ -29,10 +440,10 @@
           <w:b/>
           <w:bCs/>
         </w:rPr>
-        <w:t xml:space="preserve">¿Qué es esto? </w:t>
-      </w:r>
-      <w:r>
-        <w:t xml:space="preserve">La guía de qué hacer en tu día a día, bloque a bloque. Para el “por qué” de cada regla, o para ver el código, consulta </w:t>
+        <w:t xml:space="preserve">El matiz que más se pierde: el 40% y el 80% no son la misma regla. </w:t>
+      </w:r>
+      <w:r>
+        <w:t xml:space="preserve">El techo del 40% en </w:t>
       </w:r>
       <w:r>
         <w:rPr>
@@ -40,377 +451,41 @@
           <w:sz w:val="21"/>
           <w:szCs w:val="21"/>
         </w:rPr>
-        <w:t xml:space="preserve">docs/GOVERNANCE/SOP_ENGINE_PROJECT_STATUS.md</w:t>
-      </w:r>
-      <w:r>
-        <w:t xml:space="preserve">.</w:t>
-      </w:r>
-    </w:p>
-    <w:p>
-      <w:pPr>
-        <w:spacing w:after="160" w:line="300"/>
-      </w:pPr>
-      <w:r>
-        <w:t xml:space="preserve">Se escribe bloque a bloque, en el orden en que cada pieza queda cerrada. Hoy: Dry Powder Protocol.</w:t>
-      </w:r>
-    </w:p>
-    <w:p>
-      <w:pPr>
-        <w:pStyle w:val="Heading1"/>
-        <w:spacing w:after="160" w:before="320"/>
-      </w:pPr>
-      <w:r>
-        <w:t xml:space="preserve">1. Dry Powder Protocol</w:t>
-      </w:r>
-    </w:p>
-    <w:p>
-      <w:pPr>
-        <w:pStyle w:val="Heading2"/>
-        <w:spacing w:after="120" w:before="280"/>
-      </w:pPr>
-      <w:r>
-        <w:t xml:space="preserve">1.1 De qué va, en 30 segundos</w:t>
-      </w:r>
-    </w:p>
-    <w:p>
-      <w:pPr>
-        <w:pStyle w:val="ListParagraph"/>
-        <w:numPr>
-          <w:ilvl w:val="0"/>
-          <w:numId w:val="2"/>
-        </w:numPr>
-        <w:spacing w:after="100" w:line="300"/>
-      </w:pPr>
+        <w:t xml:space="preserve">Deploy Partially</w:t>
+      </w:r>
+      <w:r>
+        <w:t xml:space="preserve"> </w:t>
+      </w:r>
       <w:r>
         <w:rPr>
           <w:b/>
           <w:bCs/>
         </w:rPr>
-        <w:t xml:space="preserve">El problema que evita: </w:t>
-      </w:r>
-      <w:r>
-        <w:t xml:space="preserve">que te quedes paralizado esperando el “suelo perfecto”, o que te gastes toda la pólvora seca en la primera caída y no te quede nada si el mercado tiene una segunda pierna peor.</w:t>
-      </w:r>
-    </w:p>
-    <w:p>
-      <w:pPr>
-        <w:pStyle w:val="ListParagraph"/>
-        <w:numPr>
-          <w:ilvl w:val="0"/>
-          <w:numId w:val="2"/>
-        </w:numPr>
-        <w:spacing w:after="100" w:line="300"/>
-      </w:pPr>
+        <w:t xml:space="preserve">no tiene excepción.</w:t>
+      </w:r>
+      <w:r>
+        <w:t xml:space="preserve"> Si se alcanza, no se despliega más bajo esa postura — punto. El techo del 80% en </w:t>
+      </w:r>
+      <w:r>
+        <w:rPr>
+          <w:rFonts w:ascii="Consolas" w:cs="Consolas" w:eastAsia="Consolas" w:hAnsi="Consolas"/>
+          <w:sz w:val="21"/>
+          <w:szCs w:val="21"/>
+        </w:rPr>
+        <w:t xml:space="preserve">Deploy Aggressively</w:t>
+      </w:r>
+      <w:r>
+        <w:t xml:space="preserve"> </w:t>
+      </w:r>
       <w:r>
         <w:rPr>
           <w:b/>
           <w:bCs/>
         </w:rPr>
-        <w:t xml:space="preserve">Qué hace: </w:t>
-      </w:r>
-      <w:r>
-        <w:t xml:space="preserve">convierte una postura (ej. </w:t>
-      </w:r>
-      <w:r>
-        <w:rPr>
-          <w:rFonts w:ascii="Consolas" w:cs="Consolas" w:eastAsia="Consolas" w:hAnsi="Consolas"/>
-          <w:sz w:val="21"/>
-          <w:szCs w:val="21"/>
-        </w:rPr>
-        <w:t xml:space="preserve">Deploy Partially</w:t>
-      </w:r>
-      <w:r>
-        <w:t xml:space="preserve">) en una cifra concreta de euros a desplegar, tramo a tramo.</w:t>
-      </w:r>
-    </w:p>
-    <w:p>
-      <w:pPr>
-        <w:pStyle w:val="ListParagraph"/>
-        <w:numPr>
-          <w:ilvl w:val="0"/>
-          <w:numId w:val="2"/>
-        </w:numPr>
-        <w:spacing w:after="100" w:line="300"/>
-      </w:pPr>
-      <w:r>
-        <w:rPr>
-          <w:b/>
-          <w:bCs/>
-        </w:rPr>
-        <w:t xml:space="preserve">Dónde encaja: </w:t>
-      </w:r>
-      <w:r>
-        <w:t xml:space="preserve">este protocolo no decide si hoy es buen momento — eso ya lo deciden antes las otras piezas del SOP (Evidence Quality, Regime Comparability, Personal Capacity), que combinadas producen la postura del día. Dry Powder Protocol arranca </w:t>
-      </w:r>
-      <w:r>
-        <w:rPr>
-          <w:i/>
-          <w:iCs/>
-        </w:rPr>
-        <w:t xml:space="preserve">después</w:t>
-      </w:r>
-      <w:r>
-        <w:t xml:space="preserve">: dado que la postura de hoy ya autoriza desplegar algo, ¿cuánto exactamente?</w:t>
-      </w:r>
-    </w:p>
-    <w:p>
-      <w:pPr>
-        <w:pStyle w:val="ListParagraph"/>
-        <w:numPr>
-          <w:ilvl w:val="0"/>
-          <w:numId w:val="2"/>
-        </w:numPr>
-        <w:spacing w:after="100" w:line="300"/>
-      </w:pPr>
-      <w:r>
-        <w:rPr>
-          <w:b/>
-          <w:bCs/>
-        </w:rPr>
-        <w:t xml:space="preserve">Importante: </w:t>
-      </w:r>
-      <w:r>
-        <w:t xml:space="preserve">es una calculadora de riesgo. No ejecuta nada, no mueve dinero, no se conecta a ningún bróker. La decisión y la ejecución son siempre tuyas.</w:t>
-      </w:r>
-    </w:p>
-    <w:p>
-      <w:pPr>
-        <w:pStyle w:val="Heading3"/>
-        <w:spacing w:after="100" w:before="220"/>
-      </w:pPr>
-      <w:r>
-        <w:t xml:space="preserve">Las 4 reglas clave</w:t>
-      </w:r>
-    </w:p>
-    <w:p>
-      <w:pPr>
-        <w:pStyle w:val="ListParagraph"/>
-        <w:numPr>
-          <w:ilvl w:val="0"/>
-          <w:numId w:val="3"/>
-        </w:numPr>
-        <w:spacing w:after="160" w:line="300"/>
-      </w:pPr>
-      <w:r>
-        <w:rPr>
-          <w:b/>
-          <w:bCs/>
-        </w:rPr>
-        <w:t xml:space="preserve">Porcentaje sobre lo que queda, no sobre el total inicial. </w:t>
-      </w:r>
-      <w:r>
-        <w:t xml:space="preserve">Cada tramo usa un % de la pólvora seca </w:t>
-      </w:r>
-      <w:r>
-        <w:rPr>
-          <w:i/>
-          <w:iCs/>
-        </w:rPr>
-        <w:t xml:space="preserve">restante</w:t>
-      </w:r>
-      <w:r>
-        <w:t xml:space="preserve"> (12% en </w:t>
-      </w:r>
-      <w:r>
-        <w:rPr>
-          <w:rFonts w:ascii="Consolas" w:cs="Consolas" w:eastAsia="Consolas" w:hAnsi="Consolas"/>
-          <w:sz w:val="21"/>
-          <w:szCs w:val="21"/>
-        </w:rPr>
-        <w:t xml:space="preserve">Deploy Partially</w:t>
-      </w:r>
-      <w:r>
-        <w:t xml:space="preserve">, 22% en </w:t>
-      </w:r>
-      <w:r>
-        <w:rPr>
-          <w:rFonts w:ascii="Consolas" w:cs="Consolas" w:eastAsia="Consolas" w:hAnsi="Consolas"/>
-          <w:sz w:val="21"/>
-          <w:szCs w:val="21"/>
-        </w:rPr>
-        <w:t xml:space="preserve">Deploy Aggressively</w:t>
-      </w:r>
-      <w:r>
-        <w:t xml:space="preserve">). Esto por sí solo no te deja nunca a cero, pero tampoco basta: si el episodio dura mucho, tramo a tramo puedes acabar desplegando casi todo sin que ninguna decisión concreta haya autorizado ese total — para eso está la regla 3.</w:t>
-      </w:r>
-    </w:p>
-    <w:p>
-      <w:pPr>
-        <w:pStyle w:val="ListParagraph"/>
-        <w:numPr>
-          <w:ilvl w:val="0"/>
-          <w:numId w:val="3"/>
-        </w:numPr>
-        <w:spacing w:after="160" w:line="300"/>
-      </w:pPr>
-      <w:r>
-        <w:rPr>
-          <w:b/>
-          <w:bCs/>
-        </w:rPr>
-        <w:t xml:space="preserve">Cadencia dual (espaciado obligatorio). </w:t>
-      </w:r>
-      <w:r>
-        <w:t xml:space="preserve">Entre un tramo y otro deben pasar días mínimos (30 en </w:t>
-      </w:r>
-      <w:r>
-        <w:rPr>
-          <w:rFonts w:ascii="Consolas" w:cs="Consolas" w:eastAsia="Consolas" w:hAnsi="Consolas"/>
-          <w:sz w:val="21"/>
-          <w:szCs w:val="21"/>
-        </w:rPr>
-        <w:t xml:space="preserve">Partially</w:t>
-      </w:r>
-      <w:r>
-        <w:t xml:space="preserve">, 14 en </w:t>
-      </w:r>
-      <w:r>
-        <w:rPr>
-          <w:rFonts w:ascii="Consolas" w:cs="Consolas" w:eastAsia="Consolas" w:hAnsi="Consolas"/>
-          <w:sz w:val="21"/>
-          <w:szCs w:val="21"/>
-        </w:rPr>
-        <w:t xml:space="preserve">Aggressively</w:t>
-      </w:r>
-      <w:r>
-        <w:t xml:space="preserve">) </w:t>
-      </w:r>
-      <w:r>
-        <w:rPr>
-          <w:b/>
-          <w:bCs/>
-        </w:rPr>
-        <w:t xml:space="preserve">o</w:t>
-      </w:r>
-      <w:r>
-        <w:t xml:space="preserve"> una caída adicional del mercado de 5 puntos porcentuales. Basta con que se cumpla una de las dos, no las dos a la vez.</w:t>
-      </w:r>
-    </w:p>
-    <w:p>
-      <w:pPr>
-        <w:pStyle w:val="ListParagraph"/>
-        <w:numPr>
-          <w:ilvl w:val="0"/>
-          <w:numId w:val="3"/>
-        </w:numPr>
-        <w:spacing w:after="160" w:line="300"/>
-      </w:pPr>
-      <w:r>
-        <w:rPr>
-          <w:b/>
-          <w:bCs/>
-        </w:rPr>
-        <w:t xml:space="preserve">Techo de seguridad por episodio, cortafuegos, no control diario. </w:t>
-      </w:r>
-      <w:r>
-        <w:t xml:space="preserve">No puedes desplegar en total más del 40% de la pólvora inicial en </w:t>
-      </w:r>
-      <w:r>
-        <w:rPr>
-          <w:rFonts w:ascii="Consolas" w:cs="Consolas" w:eastAsia="Consolas" w:hAnsi="Consolas"/>
-          <w:sz w:val="21"/>
-          <w:szCs w:val="21"/>
-        </w:rPr>
-        <w:t xml:space="preserve">Partially</w:t>
-      </w:r>
-      <w:r>
-        <w:t xml:space="preserve"> ni más del 80% en </w:t>
-      </w:r>
-      <w:r>
-        <w:rPr>
-          <w:rFonts w:ascii="Consolas" w:cs="Consolas" w:eastAsia="Consolas" w:hAnsi="Consolas"/>
-          <w:sz w:val="21"/>
-          <w:szCs w:val="21"/>
-        </w:rPr>
-        <w:t xml:space="preserve">Aggressively</w:t>
-      </w:r>
-      <w:r>
-        <w:t xml:space="preserve">. Si lo alcanzas, se frena — y aquí hay un matiz importante que se pierde fácil: solo el techo del 80% (</w:t>
-      </w:r>
-      <w:r>
-        <w:rPr>
-          <w:rFonts w:ascii="Consolas" w:cs="Consolas" w:eastAsia="Consolas" w:hAnsi="Consolas"/>
-          <w:sz w:val="21"/>
-          <w:szCs w:val="21"/>
-        </w:rPr>
-        <w:t xml:space="preserve">Deploy Aggressively</w:t>
-      </w:r>
-      <w:r>
-        <w:t xml:space="preserve">) tiene una vía de excepción, y solo con una atestación de Human Approval vigente que lo autorice explícitamente. El techo del 40% en </w:t>
-      </w:r>
-      <w:r>
-        <w:rPr>
-          <w:rFonts w:ascii="Consolas" w:cs="Consolas" w:eastAsia="Consolas" w:hAnsi="Consolas"/>
-          <w:sz w:val="21"/>
-          <w:szCs w:val="21"/>
-        </w:rPr>
-        <w:t xml:space="preserve">Partially</w:t>
-      </w:r>
-      <w:r>
-        <w:t xml:space="preserve"> </w:t>
-      </w:r>
-      <w:r>
-        <w:rPr>
-          <w:b/>
-          <w:bCs/>
-        </w:rPr>
-        <w:t xml:space="preserve">no tiene excepción por atestación</w:t>
-      </w:r>
-      <w:r>
-        <w:t xml:space="preserve"> — una vez alcanzado, no se desplegará más bajo esa postura hasta que el episodio se cierre o la postura escale a </w:t>
-      </w:r>
-      <w:r>
-        <w:rPr>
-          <w:rFonts w:ascii="Consolas" w:cs="Consolas" w:eastAsia="Consolas" w:hAnsi="Consolas"/>
-          <w:sz w:val="21"/>
-          <w:szCs w:val="21"/>
-        </w:rPr>
-        <w:t xml:space="preserve">Aggressively</w:t>
-      </w:r>
-      <w:r>
-        <w:t xml:space="preserve"> (que tiene su propio techo, independiente).</w:t>
-      </w:r>
-    </w:p>
-    <w:p>
-      <w:pPr>
-        <w:pStyle w:val="ListParagraph"/>
-        <w:numPr>
-          <w:ilvl w:val="0"/>
-          <w:numId w:val="3"/>
-        </w:numPr>
-        <w:spacing w:after="160" w:line="300"/>
-      </w:pPr>
-      <w:r>
-        <w:rPr>
-          <w:b/>
-          <w:bCs/>
-        </w:rPr>
-        <w:t xml:space="preserve">Ratchet: el techo no retrocede dentro del mismo episodio. </w:t>
-      </w:r>
-      <w:r>
-        <w:t xml:space="preserve">Si el mercado empeora y subes a </w:t>
-      </w:r>
-      <w:r>
-        <w:rPr>
-          <w:rFonts w:ascii="Consolas" w:cs="Consolas" w:eastAsia="Consolas" w:hAnsi="Consolas"/>
-          <w:sz w:val="21"/>
-          <w:szCs w:val="21"/>
-        </w:rPr>
-        <w:t xml:space="preserve">Aggressively</w:t>
-      </w:r>
-      <w:r>
-        <w:t xml:space="preserve">, ese techo se mantiene como referencia aunque luego la postura se relaje a </w:t>
-      </w:r>
-      <w:r>
-        <w:rPr>
-          <w:rFonts w:ascii="Consolas" w:cs="Consolas" w:eastAsia="Consolas" w:hAnsi="Consolas"/>
-          <w:sz w:val="21"/>
-          <w:szCs w:val="21"/>
-        </w:rPr>
-        <w:t xml:space="preserve">Partially</w:t>
-      </w:r>
-      <w:r>
-        <w:t xml:space="preserve"> — no se “recarga” capacidad de tramo por bajar y volver a subir. Solo se resetea cuando el episodio se cierra de verdad (recuperación completa, ver 1.4).</w:t>
+        <w:t xml:space="preserve">sí puede superarse,</w:t>
+      </w:r>
+      <w:r>
+        <w:t xml:space="preserve"> pero solo con una atestación de Human Approval vigente y explícita. El sistema no calcula automáticamente cuánto desplegar más allá de ese techo — esa cifra la fijas tú a mano, según lo atestiguado.</w:t>
       </w:r>
     </w:p>
     <w:p>
@@ -1716,7 +1791,7 @@
         <w:spacing w:after="120" w:before="280"/>
       </w:pPr>
       <w:r>
-        <w:t xml:space="preserve">1.4 Cuándo se borra el historial</w:t>
+        <w:t xml:space="preserve">1.4 Qué pasa cuando termina un episodio</w:t>
       </w:r>
     </w:p>
     <w:p>
@@ -1724,14 +1799,139 @@
         <w:spacing w:after="160" w:line="300"/>
       </w:pPr>
       <w:r>
-        <w:rPr>
-          <w:b/>
-          <w:bCs/>
-        </w:rPr>
-        <w:t xml:space="preserve">Nunca. </w:t>
-      </w:r>
-      <w:r>
-        <w:t xml:space="preserve">Un episodio se cierra cuando el mercado recupera del todo su máximo anterior (Drawdown vuelve a 0). Cuando eso pase, en el próximo episodio la Sección 1 vuelve a pedir fecha y pólvora seca inicial nuevas — el ratchet y el acumulado se calculan solo sobre las filas de la Sección 2 cuya fecha caiga dentro del episodio actual. Las filas del episodio anterior se quedan en el histórico, sin tocar.</w:t>
+        <w:t xml:space="preserve">El historial no se borra nunca. Un episodio se cierra cuando el mercado recupera del todo su máximo anterior (Drawdown vuelve a 0). Cuando eso pase, en el próximo episodio la Sección 1 vuelve a pedir fecha y pólvora seca inicial nuevas — el ratchet y el acumulado se calculan solo sobre las filas de la Sección 2 cuya fecha caiga dentro del episodio actual. Las filas del episodio anterior se quedan en el histórico, sin tocar.</w:t>
+      </w:r>
+    </w:p>
+    <w:p>
+      <w:pPr>
+        <w:pStyle w:val="Heading2"/>
+        <w:spacing w:after="120" w:before="280"/>
+      </w:pPr>
+      <w:r>
+        <w:t xml:space="preserve">Checklist rápido</w:t>
+      </w:r>
+    </w:p>
+    <w:p>
+      <w:pPr>
+        <w:spacing w:after="40" w:line="300"/>
+      </w:pPr>
+      <w:r>
+        <w:t xml:space="preserve">Antes de actuar:</w:t>
+      </w:r>
+    </w:p>
+    <w:p>
+      <w:pPr>
+        <w:pStyle w:val="ListParagraph"/>
+        <w:numPr>
+          <w:ilvl w:val="0"/>
+          <w:numId w:val="2"/>
+        </w:numPr>
+        <w:spacing w:after="100" w:line="300"/>
+      </w:pPr>
+      <w:r>
+        <w:t xml:space="preserve">Ejecuta </w:t>
+      </w:r>
+      <w:r>
+        <w:rPr>
+          <w:rFonts w:ascii="Consolas" w:cs="Consolas" w:eastAsia="Consolas" w:hAnsi="Consolas"/>
+          <w:sz w:val="21"/>
+          <w:szCs w:val="21"/>
+        </w:rPr>
+        <w:t xml:space="preserve">python3 audit_posture.py</w:t>
+      </w:r>
+      <w:r>
+        <w:t xml:space="preserve">.</w:t>
+      </w:r>
+    </w:p>
+    <w:p>
+      <w:pPr>
+        <w:pStyle w:val="ListParagraph"/>
+        <w:numPr>
+          <w:ilvl w:val="0"/>
+          <w:numId w:val="2"/>
+        </w:numPr>
+        <w:spacing w:after="100" w:line="300"/>
+      </w:pPr>
+      <w:r>
+        <w:t xml:space="preserve">Comprueba si hay episodio activo.</w:t>
+      </w:r>
+    </w:p>
+    <w:p>
+      <w:pPr>
+        <w:pStyle w:val="ListParagraph"/>
+        <w:numPr>
+          <w:ilvl w:val="0"/>
+          <w:numId w:val="2"/>
+        </w:numPr>
+        <w:spacing w:after="100" w:line="300"/>
+      </w:pPr>
+      <w:r>
+        <w:t xml:space="preserve">Si no hay episodio activo, no hagas nada.</w:t>
+      </w:r>
+    </w:p>
+    <w:p>
+      <w:pPr>
+        <w:pStyle w:val="ListParagraph"/>
+        <w:numPr>
+          <w:ilvl w:val="0"/>
+          <w:numId w:val="2"/>
+        </w:numPr>
+        <w:spacing w:after="100" w:line="300"/>
+      </w:pPr>
+      <w:r>
+        <w:t xml:space="preserve">Si hay episodio activo, revisa la pestaña AMS o AML.</w:t>
+      </w:r>
+    </w:p>
+    <w:p>
+      <w:pPr>
+        <w:pStyle w:val="ListParagraph"/>
+        <w:numPr>
+          <w:ilvl w:val="0"/>
+          <w:numId w:val="2"/>
+        </w:numPr>
+        <w:spacing w:after="100" w:line="300"/>
+      </w:pPr>
+      <w:r>
+        <w:t xml:space="preserve">Si es la primera vez que aparece este episodio, rellena antes la Sección 1 (fecha inicio + pólvora seca inicial) — sin eso, el sistema no calcula ningún tramo.</w:t>
+      </w:r>
+    </w:p>
+    <w:p>
+      <w:pPr>
+        <w:pStyle w:val="ListParagraph"/>
+        <w:numPr>
+          <w:ilvl w:val="0"/>
+          <w:numId w:val="2"/>
+        </w:numPr>
+        <w:spacing w:after="100" w:line="300"/>
+      </w:pPr>
+      <w:r>
+        <w:t xml:space="preserve">Si el sistema autoriza un tramo, decide si lo ejecutas.</w:t>
+      </w:r>
+    </w:p>
+    <w:p>
+      <w:pPr>
+        <w:pStyle w:val="ListParagraph"/>
+        <w:numPr>
+          <w:ilvl w:val="0"/>
+          <w:numId w:val="2"/>
+        </w:numPr>
+        <w:spacing w:after="100" w:line="300"/>
+      </w:pPr>
+      <w:r>
+        <w:t xml:space="preserve">Si lo ejecutas, registra una fila nueva en la Sección 2 del Excel.</w:t>
+      </w:r>
+    </w:p>
+    <w:p>
+      <w:pPr>
+        <w:pStyle w:val="ListParagraph"/>
+        <w:numPr>
+          <w:ilvl w:val="0"/>
+          <w:numId w:val="2"/>
+        </w:numPr>
+        <w:spacing w:after="100" w:line="300"/>
+      </w:pPr>
+      <w:r>
+        <w:t xml:space="preserve">No borres ni sobrescribas filas anteriores.</w:t>
       </w:r>
     </w:p>
     <w:p>

</xml_diff>

<commit_message>
RE-032.10: authorizes_dry_powder_ceiling_90 (lógica) + manual operativo Sección 2 reescrita
</commit_message>
<xml_diff>
--- a/docs/MANUAL_OPERATIVO.docx
+++ b/docs/MANUAL_OPERATIVO.docx
@@ -107,7 +107,7 @@
         <w:spacing w:after="160" w:line="300"/>
       </w:pPr>
       <w:r>
-        <w:t xml:space="preserve">Se escribe bloque a bloque, en el orden en que cada pieza queda cerrada. Hoy: Dry Powder Protocol. Human Approval, pendiente.</w:t>
+        <w:t xml:space="preserve">Se escribe bloque a bloque, en el orden en que cada pieza queda cerrada. Hoy: Dry Powder Protocol y Human Approval.</w:t>
       </w:r>
     </w:p>
     <w:p>
@@ -1936,6 +1936,1604 @@
     </w:p>
     <w:p>
       <w:pPr>
+        <w:pStyle w:val="Heading1"/>
+        <w:spacing w:after="160" w:before="320"/>
+      </w:pPr>
+      <w:r>
+        <w:t xml:space="preserve">2. Human Approval</w:t>
+      </w:r>
+    </w:p>
+    <w:p>
+      <w:pPr>
+        <w:pStyle w:val="Heading2"/>
+        <w:spacing w:after="120" w:before="280"/>
+      </w:pPr>
+      <w:r>
+        <w:t xml:space="preserve">2.1 Para qué sirve</w:t>
+      </w:r>
+    </w:p>
+    <w:p>
+      <w:pPr>
+        <w:spacing w:after="160" w:line="300"/>
+      </w:pPr>
+      <w:r>
+        <w:t xml:space="preserve">Human Approval sirve para evitar que cambies tus propias reglas en caliente.</w:t>
+      </w:r>
+    </w:p>
+    <w:p>
+      <w:pPr>
+        <w:spacing w:after="160" w:line="300"/>
+      </w:pPr>
+      <w:r>
+        <w:t xml:space="preserve">En una caída fuerte, o en un momento de euforia, puede ser tentador subir tu tolerancia al riesgo justo cuando menos deberías fiarte de esa decisión.</w:t>
+      </w:r>
+    </w:p>
+    <w:p>
+      <w:pPr>
+        <w:spacing w:after="160" w:line="300"/>
+      </w:pPr>
+      <w:r>
+        <w:t xml:space="preserve">Este protocolo no te impide cambiar tu tolerancia. Lo que hace es poner una pausa obligatoria antes de que una subida empiece a contar.</w:t>
+      </w:r>
+    </w:p>
+    <w:p>
+      <w:pPr>
+        <w:spacing w:after="40" w:line="300"/>
+      </w:pPr>
+      <w:r>
+        <w:t xml:space="preserve">La pregunta que responde es:</w:t>
+      </w:r>
+    </w:p>
+    <w:p>
+      <w:pPr>
+        <w:pBdr>
+          <w:left w:val="single" w:color="808080" w:sz="18" w:space="8"/>
+        </w:pBdr>
+        <w:shd w:fill="F2F2F2" w:color="auto" w:val="clear"/>
+        <w:spacing w:after="200" w:before="120" w:line="300"/>
+        <w:ind w:left="100"/>
+      </w:pPr>
+      <w:r>
+        <w:rPr>
+          <w:i/>
+          <w:iCs/>
+        </w:rPr>
+        <w:t xml:space="preserve">¿Tengo una autorización vigente de mi “yo en frío” para actuar hasta esta postura?</w:t>
+      </w:r>
+    </w:p>
+    <w:p>
+      <w:pPr>
+        <w:spacing w:after="160" w:line="300"/>
+      </w:pPr>
+      <w:r>
+        <w:t xml:space="preserve">Human Approval no decide si el mercado es atractivo. Tampoco mueve dinero. Solo dice si tienes permiso personal vigente para actuar.</w:t>
+      </w:r>
+    </w:p>
+    <w:p>
+      <w:pPr>
+        <w:spacing w:after="40" w:line="300"/>
+      </w:pPr>
+      <w:r>
+        <w:t xml:space="preserve">Para ejecutar una decisión hacen falta las dos cosas:</w:t>
+      </w:r>
+    </w:p>
+    <w:p>
+      <w:pPr>
+        <w:pStyle w:val="ListParagraph"/>
+        <w:numPr>
+          <w:ilvl w:val="0"/>
+          <w:numId w:val="2"/>
+        </w:numPr>
+        <w:spacing w:after="100" w:line="300"/>
+      </w:pPr>
+      <w:r>
+        <w:t xml:space="preserve">que la postura combinada del SOP lo permita;</w:t>
+      </w:r>
+    </w:p>
+    <w:p>
+      <w:pPr>
+        <w:pStyle w:val="ListParagraph"/>
+        <w:numPr>
+          <w:ilvl w:val="0"/>
+          <w:numId w:val="2"/>
+        </w:numPr>
+        <w:spacing w:after="100" w:line="300"/>
+      </w:pPr>
+      <w:r>
+        <w:t xml:space="preserve">que Human Approval esté vigente.</w:t>
+      </w:r>
+    </w:p>
+    <w:p>
+      <w:pPr>
+        <w:spacing w:after="160" w:line="300"/>
+      </w:pPr>
+      <w:r>
+        <w:rPr>
+          <w:b/>
+          <w:bCs/>
+        </w:rPr>
+        <w:t xml:space="preserve">Una no compensa la otra.</w:t>
+      </w:r>
+    </w:p>
+    <w:p>
+      <w:pPr>
+        <w:pStyle w:val="Heading2"/>
+        <w:spacing w:after="120" w:before="280"/>
+      </w:pPr>
+      <w:r>
+        <w:t xml:space="preserve">2.2 Reglas principales</w:t>
+      </w:r>
+    </w:p>
+    <w:p>
+      <w:pPr>
+        <w:pStyle w:val="Heading3"/>
+        <w:spacing w:after="100" w:before="220"/>
+      </w:pPr>
+      <w:r>
+        <w:t xml:space="preserve">1. Subir tolerancia nunca aplica al instante</w:t>
+      </w:r>
+    </w:p>
+    <w:p>
+      <w:pPr>
+        <w:spacing w:after="40" w:line="300"/>
+      </w:pPr>
+      <w:r>
+        <w:t xml:space="preserve">Si autorizas una postura más agresiva que la vigente, entra en cooling-off. Plazos actuales:</w:t>
+      </w:r>
+    </w:p>
+    <w:p>
+      <w:pPr>
+        <w:pStyle w:val="ListParagraph"/>
+        <w:numPr>
+          <w:ilvl w:val="0"/>
+          <w:numId w:val="2"/>
+        </w:numPr>
+        <w:spacing w:after="100" w:line="300"/>
+      </w:pPr>
+      <w:r>
+        <w:t xml:space="preserve">14 días en condiciones normales;</w:t>
+      </w:r>
+    </w:p>
+    <w:p>
+      <w:pPr>
+        <w:pStyle w:val="ListParagraph"/>
+        <w:numPr>
+          <w:ilvl w:val="0"/>
+          <w:numId w:val="2"/>
+        </w:numPr>
+        <w:spacing w:after="100" w:line="300"/>
+      </w:pPr>
+      <w:r>
+        <w:t xml:space="preserve">30 días si hay crisis de mercado o crisis personal.</w:t>
+      </w:r>
+    </w:p>
+    <w:p>
+      <w:pPr>
+        <w:spacing w:after="160" w:line="300"/>
+      </w:pPr>
+      <w:r>
+        <w:t xml:space="preserve">Mientras dura el cooling-off, esa subida todavía no cuenta.</w:t>
+      </w:r>
+    </w:p>
+    <w:p>
+      <w:pPr>
+        <w:pStyle w:val="Heading3"/>
+        <w:spacing w:after="100" w:before="220"/>
+      </w:pPr>
+      <w:r>
+        <w:t xml:space="preserve">2. La autorización anterior sigue mandando</w:t>
+      </w:r>
+    </w:p>
+    <w:p>
+      <w:pPr>
+        <w:spacing w:after="160" w:line="300"/>
+      </w:pPr>
+      <w:r>
+        <w:t xml:space="preserve">Si ya tenías una autorización válida, no quedas bloqueado mientras esperas. Durante el cooling-off sigue vigente la autorización anterior.</w:t>
+      </w:r>
+    </w:p>
+    <w:p>
+      <w:pPr>
+        <w:spacing w:after="40" w:line="300"/>
+      </w:pPr>
+      <w:r>
+        <w:t xml:space="preserve">Ejemplo:</w:t>
+      </w:r>
+    </w:p>
+    <w:p>
+      <w:pPr>
+        <w:pStyle w:val="ListParagraph"/>
+        <w:numPr>
+          <w:ilvl w:val="0"/>
+          <w:numId w:val="2"/>
+        </w:numPr>
+        <w:spacing w:after="100" w:line="300"/>
+      </w:pPr>
+      <w:r>
+        <w:t xml:space="preserve">tenías </w:t>
+      </w:r>
+      <w:r>
+        <w:rPr>
+          <w:rFonts w:ascii="Consolas" w:cs="Consolas" w:eastAsia="Consolas" w:hAnsi="Consolas"/>
+          <w:sz w:val="21"/>
+          <w:szCs w:val="21"/>
+        </w:rPr>
+        <w:t xml:space="preserve">Prepare</w:t>
+      </w:r>
+      <w:r>
+        <w:t xml:space="preserve">;</w:t>
+      </w:r>
+    </w:p>
+    <w:p>
+      <w:pPr>
+        <w:pStyle w:val="ListParagraph"/>
+        <w:numPr>
+          <w:ilvl w:val="0"/>
+          <w:numId w:val="2"/>
+        </w:numPr>
+        <w:spacing w:after="100" w:line="300"/>
+      </w:pPr>
+      <w:r>
+        <w:t xml:space="preserve">registras subida a </w:t>
+      </w:r>
+      <w:r>
+        <w:rPr>
+          <w:rFonts w:ascii="Consolas" w:cs="Consolas" w:eastAsia="Consolas" w:hAnsi="Consolas"/>
+          <w:sz w:val="21"/>
+          <w:szCs w:val="21"/>
+        </w:rPr>
+        <w:t xml:space="preserve">Deploy Partially</w:t>
+      </w:r>
+      <w:r>
+        <w:t xml:space="preserve">;</w:t>
+      </w:r>
+    </w:p>
+    <w:p>
+      <w:pPr>
+        <w:pStyle w:val="ListParagraph"/>
+        <w:numPr>
+          <w:ilvl w:val="0"/>
+          <w:numId w:val="2"/>
+        </w:numPr>
+        <w:spacing w:after="100" w:line="300"/>
+      </w:pPr>
+      <w:r>
+        <w:t xml:space="preserve">durante 14 días sigues teniendo </w:t>
+      </w:r>
+      <w:r>
+        <w:rPr>
+          <w:rFonts w:ascii="Consolas" w:cs="Consolas" w:eastAsia="Consolas" w:hAnsi="Consolas"/>
+          <w:sz w:val="21"/>
+          <w:szCs w:val="21"/>
+        </w:rPr>
+        <w:t xml:space="preserve">Prepare</w:t>
+      </w:r>
+      <w:r>
+        <w:t xml:space="preserve">;</w:t>
+      </w:r>
+    </w:p>
+    <w:p>
+      <w:pPr>
+        <w:pStyle w:val="ListParagraph"/>
+        <w:numPr>
+          <w:ilvl w:val="0"/>
+          <w:numId w:val="2"/>
+        </w:numPr>
+        <w:spacing w:after="100" w:line="300"/>
+      </w:pPr>
+      <w:r>
+        <w:t xml:space="preserve">al terminar el plazo, pasa a </w:t>
+      </w:r>
+      <w:r>
+        <w:rPr>
+          <w:rFonts w:ascii="Consolas" w:cs="Consolas" w:eastAsia="Consolas" w:hAnsi="Consolas"/>
+          <w:sz w:val="21"/>
+          <w:szCs w:val="21"/>
+        </w:rPr>
+        <w:t xml:space="preserve">Deploy Partially</w:t>
+      </w:r>
+      <w:r>
+        <w:t xml:space="preserve">.</w:t>
+      </w:r>
+    </w:p>
+    <w:p>
+      <w:pPr>
+        <w:pStyle w:val="Heading3"/>
+        <w:spacing w:after="100" w:before="220"/>
+      </w:pPr>
+      <w:r>
+        <w:t xml:space="preserve">3. Bajar tolerancia aplica inmediatamente</w:t>
+      </w:r>
+    </w:p>
+    <w:p>
+      <w:pPr>
+        <w:spacing w:after="160" w:line="300"/>
+      </w:pPr>
+      <w:r>
+        <w:t xml:space="preserve">Si reduces tu postura autorizada, el cambio aplica en el momento. No hay cooling-off para ser más conservador. También aplica inmediatamente si repites la misma postura.</w:t>
+      </w:r>
+    </w:p>
+    <w:p>
+      <w:pPr>
+        <w:pStyle w:val="Heading3"/>
+        <w:spacing w:after="100" w:before="220"/>
+      </w:pPr>
+      <w:r>
+        <w:t xml:space="preserve">4. Toda autorización caduca</w:t>
+      </w:r>
+    </w:p>
+    <w:p>
+      <w:pPr>
+        <w:spacing w:after="160" w:line="300"/>
+      </w:pPr>
+      <w:r>
+        <w:t xml:space="preserve">Cada autorización dura 90 días desde su fecha de registro. Si no hay ninguna autorización vigente, Human Approval queda bloqueado hasta que registres una nueva.</w:t>
+      </w:r>
+    </w:p>
+    <w:p>
+      <w:pPr>
+        <w:pStyle w:val="Heading3"/>
+        <w:spacing w:after="100" w:before="220"/>
+      </w:pPr>
+      <w:r>
+        <w:t xml:space="preserve">5. Las crisis solo alargan el cooling-off</w:t>
+      </w:r>
+    </w:p>
+    <w:p>
+      <w:pPr>
+        <w:spacing w:after="160" w:line="300"/>
+      </w:pPr>
+      <w:r>
+        <w:t xml:space="preserve">Hay dos tipos de crisis: crisis de mercado y crisis personal.</w:t>
+      </w:r>
+    </w:p>
+    <w:p>
+      <w:pPr>
+        <w:spacing w:after="160" w:line="300"/>
+      </w:pPr>
+      <w:r>
+        <w:t xml:space="preserve">La crisis de mercado la calcula el sistema. Tú no la escribes. La crisis personal la declaras tú en el Excel.</w:t>
+      </w:r>
+    </w:p>
+    <w:p>
+      <w:pPr>
+        <w:spacing w:after="160" w:line="300"/>
+      </w:pPr>
+      <w:r>
+        <w:t xml:space="preserve">Ninguna de las dos autoriza ni bloquea por sí sola. Solo hacen una cosa: si estás subiendo tolerancia, el cooling-off pasa de 14 a 30 días. Nunca lo acortan.</w:t>
+      </w:r>
+    </w:p>
+    <w:p>
+      <w:pPr>
+        <w:pStyle w:val="Heading3"/>
+        <w:spacing w:after="100" w:before="220"/>
+      </w:pPr>
+      <w:r>
+        <w:t xml:space="preserve">6. El sistema mira toda la historia</w:t>
+      </w:r>
+    </w:p>
+    <w:p>
+      <w:pPr>
+        <w:spacing w:after="160" w:line="300"/>
+      </w:pPr>
+      <w:r>
+        <w:t xml:space="preserve">El sistema no compara solo la última fila contra la anterior. Reconstruye qué autorización estaba realmente vigente en cada momento.</w:t>
+      </w:r>
+    </w:p>
+    <w:p>
+      <w:pPr>
+        <w:spacing w:after="160" w:line="300"/>
+      </w:pPr>
+      <w:r>
+        <w:t xml:space="preserve">Esto evita saltarse el cooling-off encadenando revisiones. Si una subida todavía no había entrado en vigor, no cuenta como punto de partida para la siguiente.</w:t>
+      </w:r>
+    </w:p>
+    <w:p>
+      <w:pPr>
+        <w:pStyle w:val="Heading2"/>
+        <w:spacing w:after="120" w:before="280"/>
+      </w:pPr>
+      <w:r>
+        <w:t xml:space="preserve">2.3 Cómo revisar el estado</w:t>
+      </w:r>
+    </w:p>
+    <w:p>
+      <w:pPr>
+        <w:spacing w:after="40" w:line="300"/>
+      </w:pPr>
+      <w:r>
+        <w:t xml:space="preserve">Ejecuta:</w:t>
+      </w:r>
+    </w:p>
+    <w:p>
+      <w:pPr>
+        <w:pBdr>
+          <w:top w:val="single" w:color="BFBFBF" w:sz="4"/>
+          <w:bottom w:val="single" w:color="BFBFBF" w:sz="4"/>
+          <w:left w:val="single" w:color="BFBFBF" w:sz="4"/>
+          <w:right w:val="single" w:color="BFBFBF" w:sz="4"/>
+        </w:pBdr>
+        <w:shd w:fill="F2F2F2" w:color="auto" w:val="clear"/>
+        <w:spacing w:after="200" w:before="120" w:line="260"/>
+      </w:pPr>
+      <w:r>
+        <w:rPr>
+          <w:rFonts w:ascii="Consolas" w:cs="Consolas" w:eastAsia="Consolas" w:hAnsi="Consolas"/>
+          <w:sz w:val="19"/>
+          <w:szCs w:val="19"/>
+        </w:rPr>
+        <w:t xml:space="preserve">python3 audit_posture.py</w:t>
+      </w:r>
+    </w:p>
+    <w:p>
+      <w:pPr>
+        <w:spacing w:after="40" w:line="300"/>
+      </w:pPr>
+      <w:r>
+        <w:t xml:space="preserve">Busca:</w:t>
+      </w:r>
+    </w:p>
+    <w:p>
+      <w:pPr>
+        <w:pBdr>
+          <w:top w:val="single" w:color="BFBFBF" w:sz="4"/>
+          <w:bottom w:val="single" w:color="BFBFBF" w:sz="4"/>
+          <w:left w:val="single" w:color="BFBFBF" w:sz="4"/>
+          <w:right w:val="single" w:color="BFBFBF" w:sz="4"/>
+        </w:pBdr>
+        <w:shd w:fill="F2F2F2" w:color="auto" w:val="clear"/>
+        <w:spacing w:after="200" w:before="120" w:line="260"/>
+      </w:pPr>
+      <w:r>
+        <w:rPr>
+          <w:rFonts w:ascii="Consolas" w:cs="Consolas" w:eastAsia="Consolas" w:hAnsi="Consolas"/>
+          <w:sz w:val="19"/>
+          <w:szCs w:val="19"/>
+        </w:rPr>
+        <w:t xml:space="preserve">Human Approval state (AMS)</w:t>
+      </w:r>
+      <w:r>
+        <w:rPr>
+          <w:rFonts w:ascii="Consolas" w:cs="Consolas" w:eastAsia="Consolas" w:hAnsi="Consolas"/>
+          <w:sz w:val="19"/>
+          <w:szCs w:val="19"/>
+        </w:rPr>
+        <w:br/>
+        <w:t xml:space="preserve">Human Approval state (AML)</w:t>
+      </w:r>
+    </w:p>
+    <w:p>
+      <w:pPr>
+        <w:spacing w:after="40" w:line="300"/>
+      </w:pPr>
+      <w:r>
+        <w:t xml:space="preserve">Recomendación práctica:</w:t>
+      </w:r>
+    </w:p>
+    <w:p>
+      <w:pPr>
+        <w:pStyle w:val="ListParagraph"/>
+        <w:numPr>
+          <w:ilvl w:val="0"/>
+          <w:numId w:val="2"/>
+        </w:numPr>
+        <w:spacing w:after="100" w:line="300"/>
+      </w:pPr>
+      <w:r>
+        <w:t xml:space="preserve">revísalo cada vez que ejecutes </w:t>
+      </w:r>
+      <w:r>
+        <w:rPr>
+          <w:rFonts w:ascii="Consolas" w:cs="Consolas" w:eastAsia="Consolas" w:hAnsi="Consolas"/>
+          <w:sz w:val="21"/>
+          <w:szCs w:val="21"/>
+        </w:rPr>
+        <w:t xml:space="preserve">audit_posture.py</w:t>
+      </w:r>
+      <w:r>
+        <w:t xml:space="preserve">;</w:t>
+      </w:r>
+    </w:p>
+    <w:p>
+      <w:pPr>
+        <w:pStyle w:val="ListParagraph"/>
+        <w:numPr>
+          <w:ilvl w:val="0"/>
+          <w:numId w:val="2"/>
+        </w:numPr>
+        <w:spacing w:after="100" w:line="300"/>
+      </w:pPr>
+      <w:r>
+        <w:t xml:space="preserve">como mínimo, una vez al trimestre;</w:t>
+      </w:r>
+    </w:p>
+    <w:p>
+      <w:pPr>
+        <w:pStyle w:val="ListParagraph"/>
+        <w:numPr>
+          <w:ilvl w:val="0"/>
+          <w:numId w:val="2"/>
+        </w:numPr>
+        <w:spacing w:after="100" w:line="300"/>
+      </w:pPr>
+      <w:r>
+        <w:t xml:space="preserve">no esperes a que caduque.</w:t>
+      </w:r>
+    </w:p>
+    <w:p>
+      <w:pPr>
+        <w:spacing w:after="160" w:line="300"/>
+      </w:pPr>
+      <w:r>
+        <w:t xml:space="preserve">No hay aviso automático. Si no lo revisas, puede caducar sin que te enteres.</w:t>
+      </w:r>
+    </w:p>
+    <w:p>
+      <w:pPr>
+        <w:pStyle w:val="Heading2"/>
+        <w:spacing w:after="120" w:before="280"/>
+      </w:pPr>
+      <w:r>
+        <w:t xml:space="preserve">2.4 Excel de Human Approval</w:t>
+      </w:r>
+    </w:p>
+    <w:p>
+      <w:pPr>
+        <w:spacing w:after="40" w:line="300"/>
+      </w:pPr>
+      <w:r>
+        <w:t xml:space="preserve">Archivo:</w:t>
+      </w:r>
+    </w:p>
+    <w:p>
+      <w:pPr>
+        <w:pBdr>
+          <w:top w:val="single" w:color="BFBFBF" w:sz="4"/>
+          <w:bottom w:val="single" w:color="BFBFBF" w:sz="4"/>
+          <w:left w:val="single" w:color="BFBFBF" w:sz="4"/>
+          <w:right w:val="single" w:color="BFBFBF" w:sz="4"/>
+        </w:pBdr>
+        <w:shd w:fill="F2F2F2" w:color="auto" w:val="clear"/>
+        <w:spacing w:after="200" w:before="120" w:line="260"/>
+      </w:pPr>
+      <w:r>
+        <w:rPr>
+          <w:rFonts w:ascii="Consolas" w:cs="Consolas" w:eastAsia="Consolas" w:hAnsi="Consolas"/>
+          <w:sz w:val="19"/>
+          <w:szCs w:val="19"/>
+        </w:rPr>
+        <w:t xml:space="preserve">data/raw/human_approval_attestations.xlsx</w:t>
+      </w:r>
+    </w:p>
+    <w:p>
+      <w:pPr>
+        <w:spacing w:after="160" w:line="300"/>
+      </w:pPr>
+      <w:r>
+        <w:t xml:space="preserve">Hay una pestaña por patrimonio: </w:t>
+      </w:r>
+      <w:r>
+        <w:rPr>
+          <w:rFonts w:ascii="Consolas" w:cs="Consolas" w:eastAsia="Consolas" w:hAnsi="Consolas"/>
+          <w:sz w:val="21"/>
+          <w:szCs w:val="21"/>
+        </w:rPr>
+        <w:t xml:space="preserve">AMS</w:t>
+      </w:r>
+      <w:r>
+        <w:t xml:space="preserve">, </w:t>
+      </w:r>
+      <w:r>
+        <w:rPr>
+          <w:rFonts w:ascii="Consolas" w:cs="Consolas" w:eastAsia="Consolas" w:hAnsi="Consolas"/>
+          <w:sz w:val="21"/>
+          <w:szCs w:val="21"/>
+        </w:rPr>
+        <w:t xml:space="preserve">AML</w:t>
+      </w:r>
+      <w:r>
+        <w:t xml:space="preserve">.</w:t>
+      </w:r>
+    </w:p>
+    <w:p>
+      <w:pPr>
+        <w:spacing w:after="160" w:line="300"/>
+      </w:pPr>
+      <w:r>
+        <w:t xml:space="preserve">Añade una fila nueva cada vez que registres o revises formalmente tu autorización. No borres filas antiguas. No sobrescribas filas pasadas.</w:t>
+      </w:r>
+    </w:p>
+    <w:p>
+      <w:pPr>
+        <w:pStyle w:val="Heading2"/>
+        <w:spacing w:after="120" w:before="280"/>
+      </w:pPr>
+      <w:r>
+        <w:t xml:space="preserve">2.5 Qué rellenar</w:t>
+      </w:r>
+    </w:p>
+    <w:tbl>
+      <w:tblPr>
+        <w:tblW w:type="dxa" w:w="9026"/>
+        <w:tblBorders>
+          <w:top w:val="single" w:color="auto" w:sz="4"/>
+          <w:left w:val="single" w:color="auto" w:sz="4"/>
+          <w:bottom w:val="single" w:color="auto" w:sz="4"/>
+          <w:right w:val="single" w:color="auto" w:sz="4"/>
+          <w:insideH w:val="single" w:color="auto" w:sz="4"/>
+          <w:insideV w:val="single" w:color="auto" w:sz="4"/>
+        </w:tblBorders>
+      </w:tblPr>
+      <w:tblGrid>
+        <w:gridCol w:w="3200"/>
+        <w:gridCol w:w="5826"/>
+      </w:tblGrid>
+      <w:tr>
+        <w:trPr>
+          <w:tblHeader/>
+        </w:trPr>
+        <w:tc>
+          <w:tcPr>
+            <w:tcW w:type="dxa" w:w="3200"/>
+            <w:shd w:fill="D9D9D9" w:color="auto" w:val="clear"/>
+            <w:tcMar>
+              <w:top w:type="dxa" w:w="80"/>
+              <w:left w:type="dxa" w:w="100"/>
+              <w:bottom w:type="dxa" w:w="80"/>
+              <w:right w:type="dxa" w:w="100"/>
+            </w:tcMar>
+          </w:tcPr>
+          <w:p>
+            <w:pPr>
+              <w:spacing w:line="260"/>
+            </w:pPr>
+            <w:r>
+              <w:rPr>
+                <w:b/>
+                <w:bCs/>
+              </w:rPr>
+              <w:t xml:space="preserve">Columna</w:t>
+            </w:r>
+          </w:p>
+        </w:tc>
+        <w:tc>
+          <w:tcPr>
+            <w:tcW w:type="dxa" w:w="5826"/>
+            <w:shd w:fill="D9D9D9" w:color="auto" w:val="clear"/>
+            <w:tcMar>
+              <w:top w:type="dxa" w:w="80"/>
+              <w:left w:type="dxa" w:w="100"/>
+              <w:bottom w:type="dxa" w:w="80"/>
+              <w:right w:type="dxa" w:w="100"/>
+            </w:tcMar>
+          </w:tcPr>
+          <w:p>
+            <w:pPr>
+              <w:spacing w:line="260"/>
+            </w:pPr>
+            <w:r>
+              <w:rPr>
+                <w:b/>
+                <w:bCs/>
+              </w:rPr>
+              <w:t xml:space="preserve">Qué escribir</w:t>
+            </w:r>
+          </w:p>
+        </w:tc>
+      </w:tr>
+      <w:tr>
+        <w:tc>
+          <w:tcPr>
+            <w:tcW w:type="dxa" w:w="3200"/>
+            <w:tcMar>
+              <w:top w:type="dxa" w:w="80"/>
+              <w:left w:type="dxa" w:w="100"/>
+              <w:bottom w:type="dxa" w:w="80"/>
+              <w:right w:type="dxa" w:w="100"/>
+            </w:tcMar>
+          </w:tcPr>
+          <w:p>
+            <w:pPr>
+              <w:spacing w:line="260"/>
+            </w:pPr>
+            <w:r>
+              <w:rPr>
+                <w:b w:val="false"/>
+                <w:bCs w:val="false"/>
+              </w:rPr>
+              <w:t xml:space="preserve">Fecha (calendario real, AAAA-MM-DD)</w:t>
+            </w:r>
+          </w:p>
+        </w:tc>
+        <w:tc>
+          <w:tcPr>
+            <w:tcW w:type="dxa" w:w="5826"/>
+            <w:tcMar>
+              <w:top w:type="dxa" w:w="80"/>
+              <w:left w:type="dxa" w:w="100"/>
+              <w:bottom w:type="dxa" w:w="80"/>
+              <w:right w:type="dxa" w:w="100"/>
+            </w:tcMar>
+          </w:tcPr>
+          <w:p>
+            <w:pPr>
+              <w:spacing w:line="260"/>
+            </w:pPr>
+            <w:r>
+              <w:rPr>
+                <w:b w:val="false"/>
+                <w:bCs w:val="false"/>
+              </w:rPr>
+              <w:t xml:space="preserve">Fecha real de la autorización.</w:t>
+            </w:r>
+          </w:p>
+        </w:tc>
+      </w:tr>
+      <w:tr>
+        <w:tc>
+          <w:tcPr>
+            <w:tcW w:type="dxa" w:w="3200"/>
+            <w:tcMar>
+              <w:top w:type="dxa" w:w="80"/>
+              <w:left w:type="dxa" w:w="100"/>
+              <w:bottom w:type="dxa" w:w="80"/>
+              <w:right w:type="dxa" w:w="100"/>
+            </w:tcMar>
+          </w:tcPr>
+          <w:p>
+            <w:pPr>
+              <w:spacing w:line="260"/>
+            </w:pPr>
+            <w:r>
+              <w:rPr>
+                <w:b w:val="false"/>
+                <w:bCs w:val="false"/>
+              </w:rPr>
+              <w:t xml:space="preserve">Postura aprobada</w:t>
+            </w:r>
+          </w:p>
+        </w:tc>
+        <w:tc>
+          <w:tcPr>
+            <w:tcW w:type="dxa" w:w="5826"/>
+            <w:tcMar>
+              <w:top w:type="dxa" w:w="80"/>
+              <w:left w:type="dxa" w:w="100"/>
+              <w:bottom w:type="dxa" w:w="80"/>
+              <w:right w:type="dxa" w:w="100"/>
+            </w:tcMar>
+          </w:tcPr>
+          <w:p>
+            <w:pPr>
+              <w:spacing w:line="260"/>
+            </w:pPr>
+            <w:r>
+              <w:rPr>
+                <w:b w:val="false"/>
+                <w:bCs w:val="false"/>
+              </w:rPr>
+              <w:t xml:space="preserve">Techo máximo que te autorizas. No es la postura del mercado de hoy.</w:t>
+            </w:r>
+          </w:p>
+        </w:tc>
+      </w:tr>
+      <w:tr>
+        <w:tc>
+          <w:tcPr>
+            <w:tcW w:type="dxa" w:w="3200"/>
+            <w:tcMar>
+              <w:top w:type="dxa" w:w="80"/>
+              <w:left w:type="dxa" w:w="100"/>
+              <w:bottom w:type="dxa" w:w="80"/>
+              <w:right w:type="dxa" w:w="100"/>
+            </w:tcMar>
+          </w:tcPr>
+          <w:p>
+            <w:pPr>
+              <w:spacing w:line="260"/>
+            </w:pPr>
+            <w:r>
+              <w:rPr>
+                <w:b w:val="false"/>
+                <w:bCs w:val="false"/>
+              </w:rPr>
+              <w:t xml:space="preserve">Crisis personal declarada</w:t>
+            </w:r>
+          </w:p>
+        </w:tc>
+        <w:tc>
+          <w:tcPr>
+            <w:tcW w:type="dxa" w:w="5826"/>
+            <w:tcMar>
+              <w:top w:type="dxa" w:w="80"/>
+              <w:left w:type="dxa" w:w="100"/>
+              <w:bottom w:type="dxa" w:w="80"/>
+              <w:right w:type="dxa" w:w="100"/>
+            </w:tcMar>
+          </w:tcPr>
+          <w:p>
+            <w:pPr>
+              <w:spacing w:line="260"/>
+            </w:pPr>
+            <w:r>
+              <w:rPr>
+                <w:b w:val="false"/>
+                <w:bCs w:val="false"/>
+              </w:rPr>
+              <w:t xml:space="preserve">Sí o No. Sé honesto. Solo afecta al cooling-off si estás subiendo tolerancia.</w:t>
+            </w:r>
+          </w:p>
+        </w:tc>
+      </w:tr>
+      <w:tr>
+        <w:tc>
+          <w:tcPr>
+            <w:tcW w:type="dxa" w:w="3200"/>
+            <w:tcMar>
+              <w:top w:type="dxa" w:w="80"/>
+              <w:left w:type="dxa" w:w="100"/>
+              <w:bottom w:type="dxa" w:w="80"/>
+              <w:right w:type="dxa" w:w="100"/>
+            </w:tcMar>
+          </w:tcPr>
+          <w:p>
+            <w:pPr>
+              <w:spacing w:line="260"/>
+            </w:pPr>
+            <w:r>
+              <w:rPr>
+                <w:b w:val="false"/>
+                <w:bCs w:val="false"/>
+              </w:rPr>
+              <w:t xml:space="preserve">Nota</w:t>
+            </w:r>
+          </w:p>
+        </w:tc>
+        <w:tc>
+          <w:tcPr>
+            <w:tcW w:type="dxa" w:w="5826"/>
+            <w:tcMar>
+              <w:top w:type="dxa" w:w="80"/>
+              <w:left w:type="dxa" w:w="100"/>
+              <w:bottom w:type="dxa" w:w="80"/>
+              <w:right w:type="dxa" w:w="100"/>
+            </w:tcMar>
+          </w:tcPr>
+          <w:p>
+            <w:pPr>
+              <w:spacing w:line="260"/>
+            </w:pPr>
+            <w:r>
+              <w:rPr>
+                <w:b w:val="false"/>
+                <w:bCs w:val="false"/>
+              </w:rPr>
+              <w:t xml:space="preserve">Contexto para tu futuro yo.</w:t>
+            </w:r>
+          </w:p>
+        </w:tc>
+      </w:tr>
+    </w:tbl>
+    <w:p>
+      <w:pPr>
+        <w:spacing w:after="160" w:line="300"/>
+      </w:pPr>
+      <w:r>
+        <w:t xml:space="preserve">No hay columna de crisis de mercado. El sistema la calcula solo usando la fecha de la atestación y el drawdown de mercado de ese día.</w:t>
+      </w:r>
+    </w:p>
+    <w:p>
+      <w:pPr>
+        <w:pBdr>
+          <w:left w:val="single" w:color="808080" w:sz="18" w:space="8"/>
+        </w:pBdr>
+        <w:shd w:fill="F2F2F2" w:color="auto" w:val="clear"/>
+        <w:spacing w:after="200" w:before="120" w:line="300"/>
+        <w:ind w:left="100"/>
+      </w:pPr>
+      <w:r>
+        <w:rPr>
+          <w:b/>
+          <w:bCs/>
+        </w:rPr>
+        <w:t xml:space="preserve">Sobre superar el techo del 80% de Dry Powder Protocol: </w:t>
+      </w:r>
+      <w:r>
+        <w:t xml:space="preserve">RE-041.1 prevé que Human Approval pueda autorizar excepcionalmente ampliar ese techo hasta el 90% en </w:t>
+      </w:r>
+      <w:r>
+        <w:rPr>
+          <w:rFonts w:ascii="Consolas" w:cs="Consolas" w:eastAsia="Consolas" w:hAnsi="Consolas"/>
+          <w:sz w:val="21"/>
+          <w:szCs w:val="21"/>
+        </w:rPr>
+        <w:t xml:space="preserve">Deploy Aggressively</w:t>
+      </w:r>
+      <w:r>
+        <w:t xml:space="preserve">. El diseño de esa pieza ya está cerrado y la lógica interna existe (</w:t>
+      </w:r>
+      <w:r>
+        <w:rPr>
+          <w:rFonts w:ascii="Consolas" w:cs="Consolas" w:eastAsia="Consolas" w:hAnsi="Consolas"/>
+          <w:sz w:val="21"/>
+          <w:szCs w:val="21"/>
+        </w:rPr>
+        <w:t xml:space="preserve">engine/human_approval.py</w:t>
+      </w:r>
+      <w:r>
+        <w:t xml:space="preserve">), pero </w:t>
+      </w:r>
+      <w:r>
+        <w:rPr>
+          <w:b/>
+          <w:bCs/>
+        </w:rPr>
+        <w:t xml:space="preserve">todavía no es utilizable</w:t>
+      </w:r>
+      <w:r>
+        <w:t xml:space="preserve">: no hay columna en este Excel para registrarla, y </w:t>
+      </w:r>
+      <w:r>
+        <w:rPr>
+          <w:rFonts w:ascii="Consolas" w:cs="Consolas" w:eastAsia="Consolas" w:hAnsi="Consolas"/>
+          <w:sz w:val="21"/>
+          <w:szCs w:val="21"/>
+        </w:rPr>
+        <w:t xml:space="preserve">audit_posture.py</w:t>
+      </w:r>
+      <w:r>
+        <w:t xml:space="preserve"> sigue sin conectarla a Dry Powder Protocol. Esta sección se actualizará cuando esté construida de punta a punta — hasta entonces, esa vía de excepción no existe en la práctica, aunque el protocolo la contemple.</w:t>
+      </w:r>
+    </w:p>
+    <w:p>
+      <w:pPr>
+        <w:pStyle w:val="Heading2"/>
+        <w:spacing w:after="120" w:before="280"/>
+      </w:pPr>
+      <w:r>
+        <w:t xml:space="preserve">2.6 Qué significa cada estado</w:t>
+      </w:r>
+    </w:p>
+    <w:tbl>
+      <w:tblPr>
+        <w:tblW w:type="dxa" w:w="9026"/>
+        <w:tblBorders>
+          <w:top w:val="single" w:color="auto" w:sz="4"/>
+          <w:left w:val="single" w:color="auto" w:sz="4"/>
+          <w:bottom w:val="single" w:color="auto" w:sz="4"/>
+          <w:right w:val="single" w:color="auto" w:sz="4"/>
+          <w:insideH w:val="single" w:color="auto" w:sz="4"/>
+          <w:insideV w:val="single" w:color="auto" w:sz="4"/>
+        </w:tblBorders>
+      </w:tblPr>
+      <w:tblGrid>
+        <w:gridCol w:w="1600"/>
+        <w:gridCol w:w="4826"/>
+        <w:gridCol w:w="2600"/>
+      </w:tblGrid>
+      <w:tr>
+        <w:trPr>
+          <w:tblHeader/>
+        </w:trPr>
+        <w:tc>
+          <w:tcPr>
+            <w:tcW w:type="dxa" w:w="1600"/>
+            <w:shd w:fill="D9D9D9" w:color="auto" w:val="clear"/>
+            <w:tcMar>
+              <w:top w:type="dxa" w:w="80"/>
+              <w:left w:type="dxa" w:w="100"/>
+              <w:bottom w:type="dxa" w:w="80"/>
+              <w:right w:type="dxa" w:w="100"/>
+            </w:tcMar>
+          </w:tcPr>
+          <w:p>
+            <w:pPr>
+              <w:spacing w:line="260"/>
+            </w:pPr>
+            <w:r>
+              <w:rPr>
+                <w:b/>
+                <w:bCs/>
+              </w:rPr>
+              <w:t xml:space="preserve">Estado</w:t>
+            </w:r>
+          </w:p>
+        </w:tc>
+        <w:tc>
+          <w:tcPr>
+            <w:tcW w:type="dxa" w:w="4826"/>
+            <w:shd w:fill="D9D9D9" w:color="auto" w:val="clear"/>
+            <w:tcMar>
+              <w:top w:type="dxa" w:w="80"/>
+              <w:left w:type="dxa" w:w="100"/>
+              <w:bottom w:type="dxa" w:w="80"/>
+              <w:right w:type="dxa" w:w="100"/>
+            </w:tcMar>
+          </w:tcPr>
+          <w:p>
+            <w:pPr>
+              <w:spacing w:line="260"/>
+            </w:pPr>
+            <w:r>
+              <w:rPr>
+                <w:b/>
+                <w:bCs/>
+              </w:rPr>
+              <w:t xml:space="preserve">Significado</w:t>
+            </w:r>
+          </w:p>
+        </w:tc>
+        <w:tc>
+          <w:tcPr>
+            <w:tcW w:type="dxa" w:w="2600"/>
+            <w:shd w:fill="D9D9D9" w:color="auto" w:val="clear"/>
+            <w:tcMar>
+              <w:top w:type="dxa" w:w="80"/>
+              <w:left w:type="dxa" w:w="100"/>
+              <w:bottom w:type="dxa" w:w="80"/>
+              <w:right w:type="dxa" w:w="100"/>
+            </w:tcMar>
+          </w:tcPr>
+          <w:p>
+            <w:pPr>
+              <w:spacing w:line="260"/>
+            </w:pPr>
+            <w:r>
+              <w:rPr>
+                <w:b/>
+                <w:bCs/>
+              </w:rPr>
+              <w:t xml:space="preserve">Qué hacer</w:t>
+            </w:r>
+          </w:p>
+        </w:tc>
+      </w:tr>
+      <w:tr>
+        <w:tc>
+          <w:tcPr>
+            <w:tcW w:type="dxa" w:w="1600"/>
+            <w:tcMar>
+              <w:top w:type="dxa" w:w="80"/>
+              <w:left w:type="dxa" w:w="100"/>
+              <w:bottom w:type="dxa" w:w="80"/>
+              <w:right w:type="dxa" w:w="100"/>
+            </w:tcMar>
+          </w:tcPr>
+          <w:p>
+            <w:pPr>
+              <w:spacing w:line="260"/>
+            </w:pPr>
+            <w:r>
+              <w:rPr>
+                <w:b w:val="false"/>
+                <w:bCs w:val="false"/>
+              </w:rPr>
+              <w:t xml:space="preserve">missing</w:t>
+            </w:r>
+          </w:p>
+        </w:tc>
+        <w:tc>
+          <w:tcPr>
+            <w:tcW w:type="dxa" w:w="4826"/>
+            <w:tcMar>
+              <w:top w:type="dxa" w:w="80"/>
+              <w:left w:type="dxa" w:w="100"/>
+              <w:bottom w:type="dxa" w:w="80"/>
+              <w:right w:type="dxa" w:w="100"/>
+            </w:tcMar>
+          </w:tcPr>
+          <w:p>
+            <w:pPr>
+              <w:spacing w:line="260"/>
+            </w:pPr>
+            <w:r>
+              <w:rPr>
+                <w:b w:val="false"/>
+                <w:bCs w:val="false"/>
+              </w:rPr>
+              <w:t xml:space="preserve">Nunca has registrado autorización.</w:t>
+            </w:r>
+          </w:p>
+        </w:tc>
+        <w:tc>
+          <w:tcPr>
+            <w:tcW w:type="dxa" w:w="2600"/>
+            <w:tcMar>
+              <w:top w:type="dxa" w:w="80"/>
+              <w:left w:type="dxa" w:w="100"/>
+              <w:bottom w:type="dxa" w:w="80"/>
+              <w:right w:type="dxa" w:w="100"/>
+            </w:tcMar>
+          </w:tcPr>
+          <w:p>
+            <w:pPr>
+              <w:spacing w:line="260"/>
+            </w:pPr>
+            <w:r>
+              <w:rPr>
+                <w:b w:val="false"/>
+                <w:bCs w:val="false"/>
+              </w:rPr>
+              <w:t xml:space="preserve">Bloqueado. Registra una primera fila.</w:t>
+            </w:r>
+          </w:p>
+        </w:tc>
+      </w:tr>
+      <w:tr>
+        <w:tc>
+          <w:tcPr>
+            <w:tcW w:type="dxa" w:w="1600"/>
+            <w:tcMar>
+              <w:top w:type="dxa" w:w="80"/>
+              <w:left w:type="dxa" w:w="100"/>
+              <w:bottom w:type="dxa" w:w="80"/>
+              <w:right w:type="dxa" w:w="100"/>
+            </w:tcMar>
+          </w:tcPr>
+          <w:p>
+            <w:pPr>
+              <w:spacing w:line="260"/>
+            </w:pPr>
+            <w:r>
+              <w:rPr>
+                <w:b w:val="false"/>
+                <w:bCs w:val="false"/>
+              </w:rPr>
+              <w:t xml:space="preserve">expired</w:t>
+            </w:r>
+          </w:p>
+        </w:tc>
+        <w:tc>
+          <w:tcPr>
+            <w:tcW w:type="dxa" w:w="4826"/>
+            <w:tcMar>
+              <w:top w:type="dxa" w:w="80"/>
+              <w:left w:type="dxa" w:w="100"/>
+              <w:bottom w:type="dxa" w:w="80"/>
+              <w:right w:type="dxa" w:w="100"/>
+            </w:tcMar>
+          </w:tcPr>
+          <w:p>
+            <w:pPr>
+              <w:spacing w:line="260"/>
+            </w:pPr>
+            <w:r>
+              <w:rPr>
+                <w:b w:val="false"/>
+                <w:bCs w:val="false"/>
+              </w:rPr>
+              <w:t xml:space="preserve">No queda autorización vigente.</w:t>
+            </w:r>
+          </w:p>
+        </w:tc>
+        <w:tc>
+          <w:tcPr>
+            <w:tcW w:type="dxa" w:w="2600"/>
+            <w:tcMar>
+              <w:top w:type="dxa" w:w="80"/>
+              <w:left w:type="dxa" w:w="100"/>
+              <w:bottom w:type="dxa" w:w="80"/>
+              <w:right w:type="dxa" w:w="100"/>
+            </w:tcMar>
+          </w:tcPr>
+          <w:p>
+            <w:pPr>
+              <w:spacing w:line="260"/>
+            </w:pPr>
+            <w:r>
+              <w:rPr>
+                <w:b w:val="false"/>
+                <w:bCs w:val="false"/>
+              </w:rPr>
+              <w:t xml:space="preserve">Bloqueado. Registra una nueva.</w:t>
+            </w:r>
+          </w:p>
+        </w:tc>
+      </w:tr>
+      <w:tr>
+        <w:tc>
+          <w:tcPr>
+            <w:tcW w:type="dxa" w:w="1600"/>
+            <w:tcMar>
+              <w:top w:type="dxa" w:w="80"/>
+              <w:left w:type="dxa" w:w="100"/>
+              <w:bottom w:type="dxa" w:w="80"/>
+              <w:right w:type="dxa" w:w="100"/>
+            </w:tcMar>
+          </w:tcPr>
+          <w:p>
+            <w:pPr>
+              <w:spacing w:line="260"/>
+            </w:pPr>
+            <w:r>
+              <w:rPr>
+                <w:b w:val="false"/>
+                <w:bCs w:val="false"/>
+              </w:rPr>
+              <w:t xml:space="preserve">under_cooling_off</w:t>
+            </w:r>
+          </w:p>
+        </w:tc>
+        <w:tc>
+          <w:tcPr>
+            <w:tcW w:type="dxa" w:w="4826"/>
+            <w:tcMar>
+              <w:top w:type="dxa" w:w="80"/>
+              <w:left w:type="dxa" w:w="100"/>
+              <w:bottom w:type="dxa" w:w="80"/>
+              <w:right w:type="dxa" w:w="100"/>
+            </w:tcMar>
+          </w:tcPr>
+          <w:p>
+            <w:pPr>
+              <w:spacing w:line="260"/>
+            </w:pPr>
+            <w:r>
+              <w:rPr>
+                <w:b w:val="false"/>
+                <w:bCs w:val="false"/>
+              </w:rPr>
+              <w:t xml:space="preserve">Hay una subida esperando y no hay autorización anterior válida que cubra mientras tanto.</w:t>
+            </w:r>
+          </w:p>
+        </w:tc>
+        <w:tc>
+          <w:tcPr>
+            <w:tcW w:type="dxa" w:w="2600"/>
+            <w:tcMar>
+              <w:top w:type="dxa" w:w="80"/>
+              <w:left w:type="dxa" w:w="100"/>
+              <w:bottom w:type="dxa" w:w="80"/>
+              <w:right w:type="dxa" w:w="100"/>
+            </w:tcMar>
+          </w:tcPr>
+          <w:p>
+            <w:pPr>
+              <w:spacing w:line="260"/>
+            </w:pPr>
+            <w:r>
+              <w:rPr>
+                <w:b w:val="false"/>
+                <w:bCs w:val="false"/>
+              </w:rPr>
+              <w:t xml:space="preserve">Esperar hasta la fecha efectiva.</w:t>
+            </w:r>
+          </w:p>
+        </w:tc>
+      </w:tr>
+      <w:tr>
+        <w:tc>
+          <w:tcPr>
+            <w:tcW w:type="dxa" w:w="1600"/>
+            <w:tcMar>
+              <w:top w:type="dxa" w:w="80"/>
+              <w:left w:type="dxa" w:w="100"/>
+              <w:bottom w:type="dxa" w:w="80"/>
+              <w:right w:type="dxa" w:w="100"/>
+            </w:tcMar>
+          </w:tcPr>
+          <w:p>
+            <w:pPr>
+              <w:spacing w:line="260"/>
+            </w:pPr>
+            <w:r>
+              <w:rPr>
+                <w:b w:val="false"/>
+                <w:bCs w:val="false"/>
+              </w:rPr>
+              <w:t xml:space="preserve">valid</w:t>
+            </w:r>
+          </w:p>
+        </w:tc>
+        <w:tc>
+          <w:tcPr>
+            <w:tcW w:type="dxa" w:w="4826"/>
+            <w:tcMar>
+              <w:top w:type="dxa" w:w="80"/>
+              <w:left w:type="dxa" w:w="100"/>
+              <w:bottom w:type="dxa" w:w="80"/>
+              <w:right w:type="dxa" w:w="100"/>
+            </w:tcMar>
+          </w:tcPr>
+          <w:p>
+            <w:pPr>
+              <w:spacing w:line="260"/>
+            </w:pPr>
+            <w:r>
+              <w:rPr>
+                <w:b w:val="false"/>
+                <w:bCs w:val="false"/>
+              </w:rPr>
+              <w:t xml:space="preserve">Hay autorización vigente.</w:t>
+            </w:r>
+          </w:p>
+        </w:tc>
+        <w:tc>
+          <w:tcPr>
+            <w:tcW w:type="dxa" w:w="2600"/>
+            <w:tcMar>
+              <w:top w:type="dxa" w:w="80"/>
+              <w:left w:type="dxa" w:w="100"/>
+              <w:bottom w:type="dxa" w:w="80"/>
+              <w:right w:type="dxa" w:w="100"/>
+            </w:tcMar>
+          </w:tcPr>
+          <w:p>
+            <w:pPr>
+              <w:spacing w:line="260"/>
+            </w:pPr>
+            <w:r>
+              <w:rPr>
+                <w:b w:val="false"/>
+                <w:bCs w:val="false"/>
+              </w:rPr>
+              <w:t xml:space="preserve">Mira effective_posture_ceiling. Ese es tu techo personal actual.</w:t>
+            </w:r>
+          </w:p>
+        </w:tc>
+      </w:tr>
+    </w:tbl>
+    <w:p>
+      <w:pPr>
+        <w:spacing w:after="40" w:line="300"/>
+      </w:pPr>
+      <w:r>
+        <w:t xml:space="preserve">Si el estado es </w:t>
+      </w:r>
+      <w:r>
+        <w:rPr>
+          <w:rFonts w:ascii="Consolas" w:cs="Consolas" w:eastAsia="Consolas" w:hAnsi="Consolas"/>
+          <w:sz w:val="21"/>
+          <w:szCs w:val="21"/>
+        </w:rPr>
+        <w:t xml:space="preserve">valid</w:t>
+      </w:r>
+      <w:r>
+        <w:t xml:space="preserve">, puede existir además una subida pendiente. En ese caso:</w:t>
+      </w:r>
+    </w:p>
+    <w:p>
+      <w:pPr>
+        <w:pStyle w:val="ListParagraph"/>
+        <w:numPr>
+          <w:ilvl w:val="0"/>
+          <w:numId w:val="2"/>
+        </w:numPr>
+        <w:spacing w:after="100" w:line="300"/>
+      </w:pPr>
+      <w:r>
+        <w:rPr>
+          <w:rFonts w:ascii="Consolas" w:cs="Consolas" w:eastAsia="Consolas" w:hAnsi="Consolas"/>
+          <w:sz w:val="21"/>
+          <w:szCs w:val="21"/>
+        </w:rPr>
+        <w:t xml:space="preserve">effective_posture_ceiling</w:t>
+      </w:r>
+      <w:r>
+        <w:t xml:space="preserve"> = lo que manda hoy;</w:t>
+      </w:r>
+    </w:p>
+    <w:p>
+      <w:pPr>
+        <w:pStyle w:val="ListParagraph"/>
+        <w:numPr>
+          <w:ilvl w:val="0"/>
+          <w:numId w:val="2"/>
+        </w:numPr>
+        <w:spacing w:after="100" w:line="300"/>
+      </w:pPr>
+      <w:r>
+        <w:rPr>
+          <w:rFonts w:ascii="Consolas" w:cs="Consolas" w:eastAsia="Consolas" w:hAnsi="Consolas"/>
+          <w:sz w:val="21"/>
+          <w:szCs w:val="21"/>
+        </w:rPr>
+        <w:t xml:space="preserve">pending_increase</w:t>
+      </w:r>
+      <w:r>
+        <w:t xml:space="preserve"> = subida futura que todavía no aplica.</w:t>
+      </w:r>
+    </w:p>
+    <w:p>
+      <w:pPr>
+        <w:pStyle w:val="Heading2"/>
+        <w:spacing w:after="120" w:before="280"/>
+      </w:pPr>
+      <w:r>
+        <w:t xml:space="preserve">2.7 Checklist rápido</w:t>
+      </w:r>
+    </w:p>
+    <w:p>
+      <w:pPr>
+        <w:spacing w:after="40" w:line="300"/>
+      </w:pPr>
+      <w:r>
+        <w:t xml:space="preserve">Antes de actuar:</w:t>
+      </w:r>
+    </w:p>
+    <w:p>
+      <w:pPr>
+        <w:pStyle w:val="ListParagraph"/>
+        <w:numPr>
+          <w:ilvl w:val="0"/>
+          <w:numId w:val="2"/>
+        </w:numPr>
+        <w:spacing w:after="100" w:line="300"/>
+      </w:pPr>
+      <w:r>
+        <w:t xml:space="preserve">Ejecuta </w:t>
+      </w:r>
+      <w:r>
+        <w:rPr>
+          <w:rFonts w:ascii="Consolas" w:cs="Consolas" w:eastAsia="Consolas" w:hAnsi="Consolas"/>
+          <w:sz w:val="21"/>
+          <w:szCs w:val="21"/>
+        </w:rPr>
+        <w:t xml:space="preserve">python3 audit_posture.py</w:t>
+      </w:r>
+      <w:r>
+        <w:t xml:space="preserve">.</w:t>
+      </w:r>
+    </w:p>
+    <w:p>
+      <w:pPr>
+        <w:pStyle w:val="ListParagraph"/>
+        <w:numPr>
+          <w:ilvl w:val="0"/>
+          <w:numId w:val="2"/>
+        </w:numPr>
+        <w:spacing w:after="100" w:line="300"/>
+      </w:pPr>
+      <w:r>
+        <w:t xml:space="preserve">Revisa el bloque Human Approval.</w:t>
+      </w:r>
+    </w:p>
+    <w:p>
+      <w:pPr>
+        <w:pStyle w:val="ListParagraph"/>
+        <w:numPr>
+          <w:ilvl w:val="0"/>
+          <w:numId w:val="2"/>
+        </w:numPr>
+        <w:spacing w:after="100" w:line="300"/>
+      </w:pPr>
+      <w:r>
+        <w:t xml:space="preserve">Comprueba que el estado sea </w:t>
+      </w:r>
+      <w:r>
+        <w:rPr>
+          <w:rFonts w:ascii="Consolas" w:cs="Consolas" w:eastAsia="Consolas" w:hAnsi="Consolas"/>
+          <w:sz w:val="21"/>
+          <w:szCs w:val="21"/>
+        </w:rPr>
+        <w:t xml:space="preserve">valid</w:t>
+      </w:r>
+      <w:r>
+        <w:t xml:space="preserve">.</w:t>
+      </w:r>
+    </w:p>
+    <w:p>
+      <w:pPr>
+        <w:pStyle w:val="ListParagraph"/>
+        <w:numPr>
+          <w:ilvl w:val="0"/>
+          <w:numId w:val="2"/>
+        </w:numPr>
+        <w:spacing w:after="100" w:line="300"/>
+      </w:pPr>
+      <w:r>
+        <w:t xml:space="preserve">Mira </w:t>
+      </w:r>
+      <w:r>
+        <w:rPr>
+          <w:rFonts w:ascii="Consolas" w:cs="Consolas" w:eastAsia="Consolas" w:hAnsi="Consolas"/>
+          <w:sz w:val="21"/>
+          <w:szCs w:val="21"/>
+        </w:rPr>
+        <w:t xml:space="preserve">effective_posture_ceiling</w:t>
+      </w:r>
+      <w:r>
+        <w:t xml:space="preserve">.</w:t>
+      </w:r>
+    </w:p>
+    <w:p>
+      <w:pPr>
+        <w:pStyle w:val="ListParagraph"/>
+        <w:numPr>
+          <w:ilvl w:val="0"/>
+          <w:numId w:val="2"/>
+        </w:numPr>
+        <w:spacing w:after="100" w:line="300"/>
+      </w:pPr>
+      <w:r>
+        <w:t xml:space="preserve">Si hay </w:t>
+      </w:r>
+      <w:r>
+        <w:rPr>
+          <w:rFonts w:ascii="Consolas" w:cs="Consolas" w:eastAsia="Consolas" w:hAnsi="Consolas"/>
+          <w:sz w:val="21"/>
+          <w:szCs w:val="21"/>
+        </w:rPr>
+        <w:t xml:space="preserve">pending_increase</w:t>
+      </w:r>
+      <w:r>
+        <w:t xml:space="preserve">, no la uses todavía.</w:t>
+      </w:r>
+    </w:p>
+    <w:p>
+      <w:pPr>
+        <w:pStyle w:val="ListParagraph"/>
+        <w:numPr>
+          <w:ilvl w:val="0"/>
+          <w:numId w:val="2"/>
+        </w:numPr>
+        <w:spacing w:after="100" w:line="300"/>
+      </w:pPr>
+      <w:r>
+        <w:t xml:space="preserve">Si quieres subir tolerancia, registra una fila nueva y espera el cooling-off.</w:t>
+      </w:r>
+    </w:p>
+    <w:p>
+      <w:pPr>
+        <w:pStyle w:val="ListParagraph"/>
+        <w:numPr>
+          <w:ilvl w:val="0"/>
+          <w:numId w:val="2"/>
+        </w:numPr>
+        <w:spacing w:after="100" w:line="300"/>
+      </w:pPr>
+      <w:r>
+        <w:t xml:space="preserve">Si quieres bajar tolerancia, registra una fila nueva; aplica inmediatamente.</w:t>
+      </w:r>
+    </w:p>
+    <w:p>
+      <w:pPr>
+        <w:pStyle w:val="ListParagraph"/>
+        <w:numPr>
+          <w:ilvl w:val="0"/>
+          <w:numId w:val="2"/>
+        </w:numPr>
+        <w:spacing w:after="100" w:line="300"/>
+      </w:pPr>
+      <w:r>
+        <w:t xml:space="preserve">Declara crisis personal si existe.</w:t>
+      </w:r>
+    </w:p>
+    <w:p>
+      <w:pPr>
+        <w:pStyle w:val="ListParagraph"/>
+        <w:numPr>
+          <w:ilvl w:val="0"/>
+          <w:numId w:val="2"/>
+        </w:numPr>
+        <w:spacing w:after="100" w:line="300"/>
+      </w:pPr>
+      <w:r>
+        <w:t xml:space="preserve">No borres ni edites filas anteriores.</w:t>
+      </w:r>
+    </w:p>
+    <w:p>
+      <w:pPr>
+        <w:pBdr>
+          <w:left w:val="single" w:color="808080" w:sz="18" w:space="8"/>
+        </w:pBdr>
+        <w:shd w:fill="F2F2F2" w:color="auto" w:val="clear"/>
+        <w:spacing w:after="200" w:before="120" w:line="300"/>
+        <w:ind w:left="100"/>
+      </w:pPr>
+      <w:r>
+        <w:rPr>
+          <w:b/>
+          <w:bCs/>
+        </w:rPr>
+        <w:t xml:space="preserve">Recuerda: </w:t>
+      </w:r>
+      <w:r>
+        <w:t xml:space="preserve">Human Approval vigente no basta para actuar. También hace falta que la postura combinada del SOP y el Dry Powder Protocol lo permitan.</w:t>
+      </w:r>
+    </w:p>
+    <w:p>
+      <w:pPr>
         <w:pBdr>
           <w:top w:val="single" w:color="BFBFBF" w:sz="6"/>
         </w:pBdr>
@@ -1946,7 +3544,7 @@
           <w:i/>
           <w:iCs/>
         </w:rPr>
-        <w:t xml:space="preserve">Próxima sección de este manual: Human Approval — pendiente.</w:t>
+        <w:t xml:space="preserve">Manual completo por ahora. Superar el techo del 80% de Dry Powder (ver nota en 2.5) y Portfolio Reallocation Protocol quedan pendientes de que el propio sistema los tenga construidos.</w:t>
       </w:r>
     </w:p>
     <w:sectPr>
@@ -2151,6 +3749,18 @@
     <w:multiLevelType w:val="hybridMultilevel"/>
     <w:lvl w:ilvl="0" w15:tentative="1">
       <w:start w:val="1"/>
+      <w:numFmt w:val="decimal"/>
+      <w:lvlText w:val="%1."/>
+      <w:lvlJc w:val="start"/>
+      <w:pPr>
+        <w:ind w:left="540" w:hanging="360"/>
+      </w:pPr>
+    </w:lvl>
+  </w:abstractNum>
+  <w:abstractNum w:abstractNumId="5" w15:restartNumberingAfterBreak="0">
+    <w:multiLevelType w:val="hybridMultilevel"/>
+    <w:lvl w:ilvl="0" w15:tentative="1">
+      <w:start w:val="1"/>
       <w:numFmt w:val="bullet"/>
       <w:lvlText w:val="•"/>
       <w:lvlJc w:val="start"/>
@@ -2166,7 +3776,7 @@
     </w:lvlOverride>
   </w:num>
   <w:num w:numId="2">
-    <w:abstractNumId w:val="4"/>
+    <w:abstractNumId w:val="5"/>
     <w:lvlOverride w:ilvl="0">
       <w:startOverride w:val="1"/>
     </w:lvlOverride>

</xml_diff>

<commit_message>
Manual: aclarar formato fecha HA vs Shiller, reinicio 90 días al renovar, bloqueo explícito >80% en checklist
</commit_message>
<xml_diff>
--- a/docs/MANUAL_OPERATIVO.docx
+++ b/docs/MANUAL_OPERATIVO.docx
@@ -2272,6 +2272,14 @@
     </w:p>
     <w:p>
       <w:pPr>
+        <w:spacing w:after="160" w:line="300"/>
+      </w:pPr>
+      <w:r>
+        <w:t xml:space="preserve">Renovar la misma postura (regla 3) reinicia este plazo de inmediato, sin esperar cooling-off — es la forma de evitar quedarte bloqueado si se acerca la caducidad y sigues de acuerdo con tu techo actual.</w:t>
+      </w:r>
+    </w:p>
+    <w:p>
+      <w:pPr>
         <w:pStyle w:val="Heading3"/>
         <w:spacing w:after="100" w:before="220"/>
       </w:pPr>
@@ -2664,7 +2672,7 @@
                 <w:b w:val="false"/>
                 <w:bCs w:val="false"/>
               </w:rPr>
-              <w:t xml:space="preserve">Fecha real de la autorización.</w:t>
+              <w:t xml:space="preserve">Fecha del día en que haces la atestación — no la fecha en la que esperas que termine el cooling-off. Esa la calcula el sistema solo (effective_date).</w:t>
             </w:r>
           </w:p>
         </w:tc>
@@ -2814,6 +2822,30 @@
         </w:tc>
       </w:tr>
     </w:tbl>
+    <w:p>
+      <w:pPr>
+        <w:pBdr>
+          <w:left w:val="single" w:color="808080" w:sz="18" w:space="8"/>
+        </w:pBdr>
+        <w:shd w:fill="F2F2F2" w:color="auto" w:val="clear"/>
+        <w:spacing w:after="200" w:before="120" w:line="300"/>
+        <w:ind w:left="100"/>
+      </w:pPr>
+      <w:r>
+        <w:t xml:space="preserve">A diferencia de la Sección 1 de Dry Powder Protocol (que usa el mes Shiller en formato decimal, ej. </w:t>
+      </w:r>
+      <w:r>
+        <w:rPr>
+          <w:rFonts w:ascii="Consolas" w:cs="Consolas" w:eastAsia="Consolas" w:hAnsi="Consolas"/>
+          <w:sz w:val="21"/>
+          <w:szCs w:val="21"/>
+        </w:rPr>
+        <w:t xml:space="preserve">2026.07</w:t>
+      </w:r>
+      <w:r>
+        <w:t xml:space="preserve">), aquí la fecha es siempre calendario real. No mezcles los dos formatos.</w:t>
+      </w:r>
+    </w:p>
     <w:p>
       <w:pPr>
         <w:spacing w:after="160" w:line="300"/>
@@ -3510,6 +3542,19 @@
       </w:pPr>
       <w:r>
         <w:t xml:space="preserve">No borres ni edites filas anteriores.</w:t>
+      </w:r>
+    </w:p>
+    <w:p>
+      <w:pPr>
+        <w:pStyle w:val="ListParagraph"/>
+        <w:numPr>
+          <w:ilvl w:val="0"/>
+          <w:numId w:val="2"/>
+        </w:numPr>
+        <w:spacing w:after="100" w:line="300"/>
+      </w:pPr>
+      <w:r>
+        <w:t xml:space="preserve">No intentes forzar la excepción del techo del 80% en Dry Powder Protocol: el diseño ya existe en el código, pero todavía no es utilizable (ver 2.5). Trátalo como límite absoluto, hoy.</w:t>
       </w:r>
     </w:p>
     <w:p>

</xml_diff>

<commit_message>
RE-032.10 B+C+D: techo 90% real de punta a punta (Excel, wiring, manual). v1.90
</commit_message>
<xml_diff>
--- a/docs/MANUAL_OPERATIVO.docx
+++ b/docs/MANUAL_OPERATIVO.docx
@@ -381,7 +381,7 @@
         <w:t xml:space="preserve">Aggressively</w:t>
       </w:r>
       <w:r>
-        <w:t xml:space="preserve">. Si lo alcanzas, se frena. El techo del 40% y el del 80% no funcionan igual — ver el aviso justo debajo de esta lista.</w:t>
+        <w:t xml:space="preserve"> (90% si Human Approval lo ha ampliado, ver aviso debajo). Alcanzado ese techo, se frena. El techo del 40% y el del 80%/90% no funcionan igual — ver el aviso justo debajo de esta lista.</w:t>
       </w:r>
     </w:p>
     <w:p>
@@ -482,10 +482,10 @@
           <w:b/>
           <w:bCs/>
         </w:rPr>
-        <w:t xml:space="preserve">sí puede superarse,</w:t>
-      </w:r>
-      <w:r>
-        <w:t xml:space="preserve"> pero solo con una atestación de Human Approval vigente y explícita. El sistema no calcula automáticamente cuánto desplegar más allá de ese techo — esa cifra la fijas tú a mano, según lo atestiguado.</w:t>
+        <w:t xml:space="preserve">puede ampliarse al 90%,</w:t>
+      </w:r>
+      <w:r>
+        <w:t xml:space="preserve"> pero solo con una atestación de Human Approval vigente y explícita que lo autorice (ver Sección 2, Human Approval). Con esa autorización activa, el sistema sigue calculando el tramo por fórmula, igual que siempre — no hace falta fijar nada a mano. Alcanzado el 90%, se frena sin excepción posterior — nunca el 100%.</w:t>
       </w:r>
     </w:p>
     <w:p>
@@ -1332,7 +1332,7 @@
         <w:spacing w:after="160" w:line="300"/>
       </w:pPr>
       <w:r>
-        <w:t xml:space="preserve">audit_posture.py te da, por patrimonio, uno de estos cinco estados exactos:</w:t>
+        <w:t xml:space="preserve">audit_posture.py te da, por patrimonio, uno de estos cuatro estados exactos:</w:t>
       </w:r>
     </w:p>
     <w:tbl>
@@ -1614,7 +1614,7 @@
                 <w:b w:val="false"/>
                 <w:bCs w:val="false"/>
               </w:rPr>
-              <w:t xml:space="preserve">Techo acumulado alcanzado para la postura vigente. En Partially (40%) es definitivo hasta cierre o escalada. En Aggressively (80%) admite excepción vía Human Approval.</w:t>
+              <w:t xml:space="preserve">Techo acumulado alcanzado para la postura vigente: 40% en Partially (definitivo, sin excepción), u 80% en Aggressively — 90% si tu Human Approval tiene la excepción activa (ver 2.5). En ambos casos, alcanzado el techo, se frena -- no hay un techo posterior.</w:t>
             </w:r>
           </w:p>
         </w:tc>
@@ -1637,7 +1637,7 @@
                 <w:b w:val="false"/>
                 <w:bCs w:val="false"/>
               </w:rPr>
-              <w:t xml:space="preserve">Frenar, salvo excepción en Aggressively.</w:t>
+              <w:t xml:space="preserve">Frenar.</w:t>
             </w:r>
           </w:p>
         </w:tc>
@@ -1662,7 +1662,7 @@
                 <w:b w:val="false"/>
                 <w:bCs w:val="false"/>
               </w:rPr>
-              <w:t xml:space="preserve">ceiling reached, approved beyond ceiling</w:t>
+              <w:t xml:space="preserve">authorized</w:t>
             </w:r>
           </w:p>
         </w:tc>
@@ -1685,78 +1685,7 @@
                 <w:b w:val="false"/>
                 <w:bCs w:val="false"/>
               </w:rPr>
-              <w:t xml:space="preserve">Solo puede pasar en Deploy Aggressively, con una atestación de Human Approval vigente que lo autorice. El sistema no calcula el importe por fórmula aquí.</w:t>
-            </w:r>
-          </w:p>
-        </w:tc>
-        <w:tc>
-          <w:tcPr>
-            <w:tcW w:type="dxa" w:w="2426"/>
-            <w:tcMar>
-              <w:top w:type="dxa" w:w="80"/>
-              <w:left w:type="dxa" w:w="100"/>
-              <w:bottom w:type="dxa" w:w="80"/>
-              <w:right w:type="dxa" w:w="100"/>
-            </w:tcMar>
-          </w:tcPr>
-          <w:p>
-            <w:pPr>
-              <w:spacing w:line="260"/>
-            </w:pPr>
-            <w:r>
-              <w:rPr>
-                <w:b w:val="false"/>
-                <w:bCs w:val="false"/>
-              </w:rPr>
-              <w:t xml:space="preserve">Fijar tú a mano la cifra, según lo atestiguado.</w:t>
-            </w:r>
-          </w:p>
-        </w:tc>
-      </w:tr>
-      <w:tr>
-        <w:tc>
-          <w:tcPr>
-            <w:tcW w:type="dxa" w:w="2400"/>
-            <w:tcMar>
-              <w:top w:type="dxa" w:w="80"/>
-              <w:left w:type="dxa" w:w="100"/>
-              <w:bottom w:type="dxa" w:w="80"/>
-              <w:right w:type="dxa" w:w="100"/>
-            </w:tcMar>
-          </w:tcPr>
-          <w:p>
-            <w:pPr>
-              <w:spacing w:line="260"/>
-            </w:pPr>
-            <w:r>
-              <w:rPr>
-                <w:b w:val="false"/>
-                <w:bCs w:val="false"/>
-              </w:rPr>
-              <w:t xml:space="preserve">authorized</w:t>
-            </w:r>
-          </w:p>
-        </w:tc>
-        <w:tc>
-          <w:tcPr>
-            <w:tcW w:type="dxa" w:w="4200"/>
-            <w:tcMar>
-              <w:top w:type="dxa" w:w="80"/>
-              <w:left w:type="dxa" w:w="100"/>
-              <w:bottom w:type="dxa" w:w="80"/>
-              <w:right w:type="dxa" w:w="100"/>
-            </w:tcMar>
-          </w:tcPr>
-          <w:p>
-            <w:pPr>
-              <w:spacing w:line="260"/>
-            </w:pPr>
-            <w:r>
-              <w:rPr>
-                <w:b w:val="false"/>
-                <w:bCs w:val="false"/>
-              </w:rPr>
-              <w:t xml:space="preserve">Luz verde: el sistema te da una cifra concreta (authorized_amount).</w:t>
+              <w:t xml:space="preserve">Luz verde: el sistema te da una cifra concreta (authorized_amount), calculada por fórmula tanto dentro del techo normal como dentro de la ampliación del 90% si aplica.</w:t>
             </w:r>
           </w:p>
         </w:tc>
@@ -2871,39 +2800,71 @@
         <w:t xml:space="preserve">Sobre superar el techo del 80% de Dry Powder Protocol: </w:t>
       </w:r>
       <w:r>
-        <w:t xml:space="preserve">RE-041.1 prevé que Human Approval pueda autorizar excepcionalmente ampliar ese techo hasta el 90% en </w:t>
-      </w:r>
-      <w:r>
-        <w:rPr>
-          <w:rFonts w:ascii="Consolas" w:cs="Consolas" w:eastAsia="Consolas" w:hAnsi="Consolas"/>
-          <w:sz w:val="21"/>
-          <w:szCs w:val="21"/>
-        </w:rPr>
-        <w:t xml:space="preserve">Deploy Aggressively</w:t>
-      </w:r>
-      <w:r>
-        <w:t xml:space="preserve">. El diseño de esa pieza ya está cerrado y la lógica interna existe (</w:t>
-      </w:r>
-      <w:r>
-        <w:rPr>
-          <w:rFonts w:ascii="Consolas" w:cs="Consolas" w:eastAsia="Consolas" w:hAnsi="Consolas"/>
-          <w:sz w:val="21"/>
-          <w:szCs w:val="21"/>
-        </w:rPr>
-        <w:t xml:space="preserve">engine/human_approval.py</w:t>
-      </w:r>
-      <w:r>
-        <w:t xml:space="preserve">), pero </w:t>
+        <w:t xml:space="preserve">ya es real y usable de punta a punta. Marca </w:t>
       </w:r>
       <w:r>
         <w:rPr>
           <w:b/>
           <w:bCs/>
         </w:rPr>
-        <w:t xml:space="preserve">todavía no es utilizable</w:t>
-      </w:r>
-      <w:r>
-        <w:t xml:space="preserve">: no hay columna en este Excel para registrarla, y </w:t>
+        <w:t xml:space="preserve">Sí</w:t>
+      </w:r>
+      <w:r>
+        <w:t xml:space="preserve"> en la columna </w:t>
+      </w:r>
+      <w:r>
+        <w:rPr>
+          <w:b/>
+          <w:bCs/>
+        </w:rPr>
+        <w:t xml:space="preserve">Autoriza techo 90%</w:t>
+      </w:r>
+      <w:r>
+        <w:t xml:space="preserve"> de esa misma fila (solo tiene efecto si </w:t>
+      </w:r>
+      <w:r>
+        <w:rPr>
+          <w:rFonts w:ascii="Consolas" w:cs="Consolas" w:eastAsia="Consolas" w:hAnsi="Consolas"/>
+          <w:sz w:val="21"/>
+          <w:szCs w:val="21"/>
+        </w:rPr>
+        <w:t xml:space="preserve">Postura aprobada</w:t>
+      </w:r>
+      <w:r>
+        <w:t xml:space="preserve"> es </w:t>
+      </w:r>
+      <w:r>
+        <w:rPr>
+          <w:rFonts w:ascii="Consolas" w:cs="Consolas" w:eastAsia="Consolas" w:hAnsi="Consolas"/>
+          <w:sz w:val="21"/>
+          <w:szCs w:val="21"/>
+        </w:rPr>
+        <w:t xml:space="preserve">Deploy Aggressively</w:t>
+      </w:r>
+      <w:r>
+        <w:t xml:space="preserve">). Tiene su propio cooling-off fijo de 30 días, independiente del de la postura — cuenta desde la fecha de esta fila, no desde cuándo se alcance el 80%. Con la autorización vigente, </w:t>
+      </w:r>
+      <w:r>
+        <w:rPr>
+          <w:rFonts w:ascii="Consolas" w:cs="Consolas" w:eastAsia="Consolas" w:hAnsi="Consolas"/>
+          <w:sz w:val="21"/>
+          <w:szCs w:val="21"/>
+        </w:rPr>
+        <w:t xml:space="preserve">dry_powder_protocol.py</w:t>
+      </w:r>
+      <w:r>
+        <w:t xml:space="preserve"> calcula los tramos por fórmula igual que siempre, solo que con techo en 90% en vez de 80% — nunca hace falta fijar nada a mano, y nunca llega al 100%. Revisa </w:t>
+      </w:r>
+      <w:r>
+        <w:rPr>
+          <w:rFonts w:ascii="Consolas" w:cs="Consolas" w:eastAsia="Consolas" w:hAnsi="Consolas"/>
+          <w:sz w:val="21"/>
+          <w:szCs w:val="21"/>
+        </w:rPr>
+        <w:t xml:space="preserve">Human Approval authorizes_dry_powder_ceiling_90</w:t>
+      </w:r>
+      <w:r>
+        <w:t xml:space="preserve"> en la salida de </w:t>
       </w:r>
       <w:r>
         <w:rPr>
@@ -2914,7 +2875,7 @@
         <w:t xml:space="preserve">audit_posture.py</w:t>
       </w:r>
       <w:r>
-        <w:t xml:space="preserve"> sigue sin conectarla a Dry Powder Protocol. Esta sección se actualizará cuando esté construida de punta a punta — hasta entonces, esa vía de excepción no existe en la práctica, aunque el protocolo la contemple.</w:t>
+        <w:t xml:space="preserve"> para confirmar que está activa antes de contar con ella.</w:t>
       </w:r>
     </w:p>
     <w:p>
@@ -3368,6 +3329,69 @@
     </w:p>
     <w:p>
       <w:pPr>
+        <w:spacing w:after="160" w:line="300"/>
+      </w:pPr>
+      <w:r>
+        <w:t xml:space="preserve">Además, si estás en </w:t>
+      </w:r>
+      <w:r>
+        <w:rPr>
+          <w:rFonts w:ascii="Consolas" w:cs="Consolas" w:eastAsia="Consolas" w:hAnsi="Consolas"/>
+          <w:sz w:val="21"/>
+          <w:szCs w:val="21"/>
+        </w:rPr>
+        <w:t xml:space="preserve">Deploy Aggressively</w:t>
+      </w:r>
+      <w:r>
+        <w:t xml:space="preserve">, revisa </w:t>
+      </w:r>
+      <w:r>
+        <w:rPr>
+          <w:rFonts w:ascii="Consolas" w:cs="Consolas" w:eastAsia="Consolas" w:hAnsi="Consolas"/>
+          <w:sz w:val="21"/>
+          <w:szCs w:val="21"/>
+        </w:rPr>
+        <w:t xml:space="preserve">authorizes_dry_powder_ceiling_90</w:t>
+      </w:r>
+      <w:r>
+        <w:t xml:space="preserve"> en la salida de </w:t>
+      </w:r>
+      <w:r>
+        <w:rPr>
+          <w:rFonts w:ascii="Consolas" w:cs="Consolas" w:eastAsia="Consolas" w:hAnsi="Consolas"/>
+          <w:sz w:val="21"/>
+          <w:szCs w:val="21"/>
+        </w:rPr>
+        <w:t xml:space="preserve">audit_posture.py</w:t>
+      </w:r>
+      <w:r>
+        <w:t xml:space="preserve">: </w:t>
+      </w:r>
+      <w:r>
+        <w:rPr>
+          <w:rFonts w:ascii="Consolas" w:cs="Consolas" w:eastAsia="Consolas" w:hAnsi="Consolas"/>
+          <w:sz w:val="21"/>
+          <w:szCs w:val="21"/>
+        </w:rPr>
+        <w:t xml:space="preserve">True</w:t>
+      </w:r>
+      <w:r>
+        <w:t xml:space="preserve"> significa que tu techo de Dry Powder Protocol para este episodio es 90% en vez de 80% (ver 2.5). </w:t>
+      </w:r>
+      <w:r>
+        <w:rPr>
+          <w:rFonts w:ascii="Consolas" w:cs="Consolas" w:eastAsia="Consolas" w:hAnsi="Consolas"/>
+          <w:sz w:val="21"/>
+          <w:szCs w:val="21"/>
+        </w:rPr>
+        <w:t xml:space="preserve">False</w:t>
+      </w:r>
+      <w:r>
+        <w:t xml:space="preserve"> es el caso normal — techo en 80%, sin nada que hacer.</w:t>
+      </w:r>
+    </w:p>
+    <w:p>
+      <w:pPr>
         <w:pStyle w:val="Heading2"/>
         <w:spacing w:after="120" w:before="280"/>
       </w:pPr>
@@ -3554,7 +3578,38 @@
         <w:spacing w:after="100" w:line="300"/>
       </w:pPr>
       <w:r>
-        <w:t xml:space="preserve">No intentes forzar la excepción del techo del 80% en Dry Powder Protocol: el diseño ya existe en el código, pero todavía no es utilizable (ver 2.5). Trátalo como límite absoluto, hoy.</w:t>
+        <w:t xml:space="preserve">Si quieres ampliar el techo del 80% de Dry Powder Protocol a 90%, marca </w:t>
+      </w:r>
+      <w:r>
+        <w:rPr>
+          <w:b/>
+          <w:bCs/>
+        </w:rPr>
+        <w:t xml:space="preserve">Sí</w:t>
+      </w:r>
+      <w:r>
+        <w:t xml:space="preserve"> en </w:t>
+      </w:r>
+      <w:r>
+        <w:rPr>
+          <w:b/>
+          <w:bCs/>
+        </w:rPr>
+        <w:t xml:space="preserve">Autoriza techo 90%</w:t>
+      </w:r>
+      <w:r>
+        <w:t xml:space="preserve"> de esa misma fila (solo con postura </w:t>
+      </w:r>
+      <w:r>
+        <w:rPr>
+          <w:rFonts w:ascii="Consolas" w:cs="Consolas" w:eastAsia="Consolas" w:hAnsi="Consolas"/>
+          <w:sz w:val="21"/>
+          <w:szCs w:val="21"/>
+        </w:rPr>
+        <w:t xml:space="preserve">Deploy Aggressively</w:t>
+      </w:r>
+      <w:r>
+        <w:t xml:space="preserve">) y espera su propio cooling-off de 30 días — ver 2.5.</w:t>
       </w:r>
     </w:p>
     <w:p>
@@ -3589,7 +3644,7 @@
           <w:i/>
           <w:iCs/>
         </w:rPr>
-        <w:t xml:space="preserve">Manual completo por ahora. Superar el techo del 80% de Dry Powder (ver nota en 2.5) y Portfolio Reallocation Protocol quedan pendientes de que el propio sistema los tenga construidos.</w:t>
+        <w:t xml:space="preserve">Manual completo por ahora. Portfolio Reallocation Protocol queda pendiente de que el propio sistema lo tenga construido.</w:t>
       </w:r>
     </w:p>
     <w:sectPr>

</xml_diff>

<commit_message>
Manual 1.3: tabla ceiling reached simplificada a 4 estados, nota CEILING_REACHED_APPROVED reservado
</commit_message>
<xml_diff>
--- a/docs/MANUAL_OPERATIVO.docx
+++ b/docs/MANUAL_OPERATIVO.docx
@@ -1472,7 +1472,7 @@
                 <w:b w:val="false"/>
                 <w:bCs w:val="false"/>
               </w:rPr>
-              <w:t xml:space="preserve">La postura de hoy (Conserve/Prepare/Blocked) no autoriza desplegar nada.</w:t>
+              <w:t xml:space="preserve">La postura de hoy no autoriza desplegar nada.</w:t>
             </w:r>
           </w:p>
         </w:tc>
@@ -1543,7 +1543,7 @@
                 <w:b w:val="false"/>
                 <w:bCs w:val="false"/>
               </w:rPr>
-              <w:t xml:space="preserve">Aún no toca: no han pasado ni los días mínimos ni los puntos de caída adicional desde el último tramo.</w:t>
+              <w:t xml:space="preserve">Aún no toca otro tramo.</w:t>
             </w:r>
           </w:p>
         </w:tc>
@@ -1614,7 +1614,7 @@
                 <w:b w:val="false"/>
                 <w:bCs w:val="false"/>
               </w:rPr>
-              <w:t xml:space="preserve">Techo acumulado alcanzado para la postura vigente: 40% en Partially (definitivo, sin excepción), u 80% en Aggressively — 90% si tu Human Approval tiene la excepción activa (ver 2.5). En ambos casos, alcanzado el techo, se frena -- no hay un techo posterior.</w:t>
+              <w:t xml:space="preserve">Ya se alcanzó el techo acumulado aplicable: 40%, 80% o 90%, según postura y Human Approval extraordinario.</w:t>
             </w:r>
           </w:p>
         </w:tc>
@@ -1637,7 +1637,7 @@
                 <w:b w:val="false"/>
                 <w:bCs w:val="false"/>
               </w:rPr>
-              <w:t xml:space="preserve">Frenar.</w:t>
+              <w:t xml:space="preserve">No desplegar más.</w:t>
             </w:r>
           </w:p>
         </w:tc>
@@ -1685,7 +1685,7 @@
                 <w:b w:val="false"/>
                 <w:bCs w:val="false"/>
               </w:rPr>
-              <w:t xml:space="preserve">Luz verde: el sistema te da una cifra concreta (authorized_amount), calculada por fórmula tanto dentro del techo normal como dentro de la ampliación del 90% si aplica.</w:t>
+              <w:t xml:space="preserve">El sistema autoriza un tramo y calcula authorized_amount.</w:t>
             </w:r>
           </w:p>
         </w:tc>
@@ -1708,12 +1708,106 @@
                 <w:b w:val="false"/>
                 <w:bCs w:val="false"/>
               </w:rPr>
-              <w:t xml:space="preserve">Recomendación de compra — decides si la ejecutas.</w:t>
+              <w:t xml:space="preserve">Decides si lo ejecutas.</w:t>
             </w:r>
           </w:p>
         </w:tc>
       </w:tr>
     </w:tbl>
+    <w:p>
+      <w:pPr>
+        <w:pBdr>
+          <w:left w:val="single" w:color="808080" w:sz="18" w:space="8"/>
+        </w:pBdr>
+        <w:shd w:fill="F2F2F2" w:color="auto" w:val="clear"/>
+        <w:spacing w:after="200" w:before="120" w:line="300"/>
+        <w:ind w:left="100"/>
+      </w:pPr>
+      <w:r>
+        <w:rPr>
+          <w:b/>
+          <w:bCs/>
+        </w:rPr>
+        <w:t xml:space="preserve">ceiling reached, en detalle: </w:t>
+      </w:r>
+      <w:r>
+        <w:t xml:space="preserve">puede significar una de tres cosas: el 40% en </w:t>
+      </w:r>
+      <w:r>
+        <w:rPr>
+          <w:rFonts w:ascii="Consolas" w:cs="Consolas" w:eastAsia="Consolas" w:hAnsi="Consolas"/>
+          <w:sz w:val="21"/>
+          <w:szCs w:val="21"/>
+        </w:rPr>
+        <w:t xml:space="preserve">Deploy Partially</w:t>
+      </w:r>
+      <w:r>
+        <w:t xml:space="preserve"> (sin excepción posible); el 80% en </w:t>
+      </w:r>
+      <w:r>
+        <w:rPr>
+          <w:rFonts w:ascii="Consolas" w:cs="Consolas" w:eastAsia="Consolas" w:hAnsi="Consolas"/>
+          <w:sz w:val="21"/>
+          <w:szCs w:val="21"/>
+        </w:rPr>
+        <w:t xml:space="preserve">Deploy Aggressively</w:t>
+      </w:r>
+      <w:r>
+        <w:t xml:space="preserve"> sin autorización extraordinaria vigente; o el 90% en </w:t>
+      </w:r>
+      <w:r>
+        <w:rPr>
+          <w:rFonts w:ascii="Consolas" w:cs="Consolas" w:eastAsia="Consolas" w:hAnsi="Consolas"/>
+          <w:sz w:val="21"/>
+          <w:szCs w:val="21"/>
+        </w:rPr>
+        <w:t xml:space="preserve">Deploy Aggressively</w:t>
+      </w:r>
+      <w:r>
+        <w:t xml:space="preserve"> con autorización extraordinaria vigente (ver 2.5). En los tres casos, no se despliega más bajo este protocolo. El sistema nunca calcula ni autoriza despliegues por encima del techo que corresponda — nunca el 100%, bajo ninguna circunstancia.</w:t>
+      </w:r>
+    </w:p>
+    <w:p>
+      <w:pPr>
+        <w:spacing w:after="160" w:line="300"/>
+      </w:pPr>
+      <w:r>
+        <w:t xml:space="preserve">El estado </w:t>
+      </w:r>
+      <w:r>
+        <w:rPr>
+          <w:rFonts w:ascii="Consolas" w:cs="Consolas" w:eastAsia="Consolas" w:hAnsi="Consolas"/>
+          <w:sz w:val="21"/>
+          <w:szCs w:val="21"/>
+        </w:rPr>
+        <w:t xml:space="preserve">ceiling reached, approved beyond ceiling</w:t>
+      </w:r>
+      <w:r>
+        <w:t xml:space="preserve"> (</w:t>
+      </w:r>
+      <w:r>
+        <w:rPr>
+          <w:rFonts w:ascii="Consolas" w:cs="Consolas" w:eastAsia="Consolas" w:hAnsi="Consolas"/>
+          <w:sz w:val="21"/>
+          <w:szCs w:val="21"/>
+        </w:rPr>
+        <w:t xml:space="preserve">CEILING_REACHED_APPROVED</w:t>
+      </w:r>
+      <w:r>
+        <w:t xml:space="preserve">) sigue definido en el código por si en el futuro hace falta una tercera excepción, pero hoy no lo produce nunca — no aparecerá en la salida de </w:t>
+      </w:r>
+      <w:r>
+        <w:rPr>
+          <w:rFonts w:ascii="Consolas" w:cs="Consolas" w:eastAsia="Consolas" w:hAnsi="Consolas"/>
+          <w:sz w:val="21"/>
+          <w:szCs w:val="21"/>
+        </w:rPr>
+        <w:t xml:space="preserve">audit_posture.py</w:t>
+      </w:r>
+      <w:r>
+        <w:t xml:space="preserve">.</w:t>
+      </w:r>
+    </w:p>
     <w:p>
       <w:pPr>
         <w:pStyle w:val="Heading2"/>

</xml_diff>